<commit_message>
docs: extend project documentation with diagrams
</commit_message>
<xml_diff>
--- a/RiskGuard_Документация.docx
+++ b/RiskGuard_Документация.docx
@@ -6331,6 +6331,4143 @@
         </w:rPr>
       </w:pPr>
     </w:p>
+    <w:p>
+      <w:r>
+        <w:br w:type="page"/>
+      </w:r>
+    </w:p>
+    <w:p>
+      <w:pPr>
+        <w:pStyle w:val="1"/>
+      </w:pPr>
+      <w:r>
+        <w:rPr>
+          <w:rFonts w:ascii="Calibri" w:hAnsi="Calibri"/>
+          <w:color w:val="0F2346"/>
+        </w:rPr>
+        <w:t>ДОПОЛНИТЕЛЬНЫЕ РАЗДЕЛЫ ПО СТРУКТУРЕ ПРИМЕРА</w:t>
+      </w:r>
+    </w:p>
+    <w:p>
+      <w:pPr>
+        <w:spacing w:after="120"/>
+      </w:pPr>
+      <w:r>
+        <w:t>Ниже добавлены разделы, которых не хватало относительно предоставленного примера документации. Они адаптированы под RiskGuard: вместо абстрактного нагрузочного тест-плана описаны демонстрационные нагрузки, стратегия проверки, тестовая среда, мониторинг, классификация ошибок и карта диаграмм.</w:t>
+      </w:r>
+    </w:p>
+    <w:p>
+      <w:pPr>
+        <w:pStyle w:val="21"/>
+      </w:pPr>
+      <w:r>
+        <w:rPr>
+          <w:rFonts w:ascii="Calibri" w:hAnsi="Calibri"/>
+          <w:color w:val="0F2346"/>
+        </w:rPr>
+        <w:t>МОДЕЛЬ НАГРУЗКИ И ДЕМОНСТРАЦИОННЫЕ СЦЕНАРИИ</w:t>
+      </w:r>
+    </w:p>
+    <w:p>
+      <w:pPr>
+        <w:spacing w:after="120"/>
+      </w:pPr>
+      <w:r>
+        <w:t>Для учебного проекта нагрузка рассматривается как модель типового демонстрационного дня. Она нужна не для промышленного расчета серверов, а для объяснения, какие операции являются частыми, какие тяжелыми и какие роли создают основную активность.</w:t>
+      </w:r>
+    </w:p>
+    <w:tbl>
+      <w:tblPr>
+        <w:tblStyle w:val="aff0"/>
+        <w:tblW w:type="auto" w:w="0"/>
+        <w:jc w:val="center"/>
+        <w:tblLook w:firstColumn="1" w:firstRow="1" w:lastColumn="0" w:lastRow="0" w:noHBand="0" w:noVBand="1" w:val="04A0"/>
+      </w:tblPr>
+      <w:tblGrid>
+        <w:gridCol w:w="2016"/>
+        <w:gridCol w:w="2016"/>
+        <w:gridCol w:w="2016"/>
+        <w:gridCol w:w="2016"/>
+        <w:gridCol w:w="2016"/>
+      </w:tblGrid>
+      <w:tr>
+        <w:tc>
+          <w:tcPr>
+            <w:tcW w:type="dxa" w:w="2016"/>
+            <w:vAlign w:val="center"/>
+            <w:shd w:fill="EAF2FF"/>
+          </w:tcPr>
+          <w:p>
+            <w:pPr>
+              <w:spacing w:after="0"/>
+            </w:pPr>
+            <w:r/>
+            <w:r>
+              <w:rPr>
+                <w:rFonts w:ascii="Calibri" w:hAnsi="Calibri"/>
+                <w:b/>
+                <w:sz w:val="20"/>
+              </w:rPr>
+              <w:t>Операция</w:t>
+            </w:r>
+          </w:p>
+        </w:tc>
+        <w:tc>
+          <w:tcPr>
+            <w:tcW w:type="dxa" w:w="2016"/>
+            <w:vAlign w:val="center"/>
+            <w:shd w:fill="EAF2FF"/>
+          </w:tcPr>
+          <w:p>
+            <w:pPr>
+              <w:spacing w:after="0"/>
+            </w:pPr>
+            <w:r/>
+            <w:r>
+              <w:rPr>
+                <w:rFonts w:ascii="Calibri" w:hAnsi="Calibri"/>
+                <w:b/>
+                <w:sz w:val="20"/>
+              </w:rPr>
+              <w:t>Роль</w:t>
+            </w:r>
+          </w:p>
+        </w:tc>
+        <w:tc>
+          <w:tcPr>
+            <w:tcW w:type="dxa" w:w="2016"/>
+            <w:vAlign w:val="center"/>
+            <w:shd w:fill="EAF2FF"/>
+          </w:tcPr>
+          <w:p>
+            <w:pPr>
+              <w:spacing w:after="0"/>
+            </w:pPr>
+            <w:r/>
+            <w:r>
+              <w:rPr>
+                <w:rFonts w:ascii="Calibri" w:hAnsi="Calibri"/>
+                <w:b/>
+                <w:sz w:val="20"/>
+              </w:rPr>
+              <w:t>Клиент</w:t>
+            </w:r>
+          </w:p>
+        </w:tc>
+        <w:tc>
+          <w:tcPr>
+            <w:tcW w:type="dxa" w:w="2016"/>
+            <w:vAlign w:val="center"/>
+            <w:shd w:fill="EAF2FF"/>
+          </w:tcPr>
+          <w:p>
+            <w:pPr>
+              <w:spacing w:after="0"/>
+            </w:pPr>
+            <w:r/>
+            <w:r>
+              <w:rPr>
+                <w:rFonts w:ascii="Calibri" w:hAnsi="Calibri"/>
+                <w:b/>
+                <w:sz w:val="20"/>
+              </w:rPr>
+              <w:t>Ожидаемая частота</w:t>
+            </w:r>
+          </w:p>
+        </w:tc>
+        <w:tc>
+          <w:tcPr>
+            <w:tcW w:type="dxa" w:w="2016"/>
+            <w:vAlign w:val="center"/>
+            <w:shd w:fill="EAF2FF"/>
+          </w:tcPr>
+          <w:p>
+            <w:pPr>
+              <w:spacing w:after="0"/>
+            </w:pPr>
+            <w:r/>
+            <w:r>
+              <w:rPr>
+                <w:rFonts w:ascii="Calibri" w:hAnsi="Calibri"/>
+                <w:b/>
+                <w:sz w:val="20"/>
+              </w:rPr>
+              <w:t>Комментарий</w:t>
+            </w:r>
+          </w:p>
+        </w:tc>
+      </w:tr>
+      <w:tr>
+        <w:tc>
+          <w:tcPr>
+            <w:tcW w:type="dxa" w:w="2016"/>
+            <w:vAlign w:val="center"/>
+          </w:tcPr>
+          <w:p>
+            <w:pPr>
+              <w:spacing w:after="0"/>
+            </w:pPr>
+            <w:r/>
+            <w:r>
+              <w:rPr>
+                <w:rFonts w:ascii="Calibri" w:hAnsi="Calibri"/>
+                <w:b w:val="0"/>
+                <w:sz w:val="20"/>
+              </w:rPr>
+              <w:t>Вход в систему</w:t>
+            </w:r>
+          </w:p>
+        </w:tc>
+        <w:tc>
+          <w:tcPr>
+            <w:tcW w:type="dxa" w:w="2016"/>
+            <w:vAlign w:val="center"/>
+          </w:tcPr>
+          <w:p>
+            <w:pPr>
+              <w:spacing w:after="0"/>
+            </w:pPr>
+            <w:r/>
+            <w:r>
+              <w:rPr>
+                <w:rFonts w:ascii="Calibri" w:hAnsi="Calibri"/>
+                <w:b w:val="0"/>
+                <w:sz w:val="20"/>
+              </w:rPr>
+              <w:t>Все роли</w:t>
+            </w:r>
+          </w:p>
+        </w:tc>
+        <w:tc>
+          <w:tcPr>
+            <w:tcW w:type="dxa" w:w="2016"/>
+            <w:vAlign w:val="center"/>
+          </w:tcPr>
+          <w:p>
+            <w:pPr>
+              <w:spacing w:after="0"/>
+            </w:pPr>
+            <w:r/>
+            <w:r>
+              <w:rPr>
+                <w:rFonts w:ascii="Calibri" w:hAnsi="Calibri"/>
+                <w:b w:val="0"/>
+                <w:sz w:val="20"/>
+              </w:rPr>
+              <w:t>Web / Desktop / APK</w:t>
+            </w:r>
+          </w:p>
+        </w:tc>
+        <w:tc>
+          <w:tcPr>
+            <w:tcW w:type="dxa" w:w="2016"/>
+            <w:vAlign w:val="center"/>
+          </w:tcPr>
+          <w:p>
+            <w:pPr>
+              <w:spacing w:after="0"/>
+            </w:pPr>
+            <w:r/>
+            <w:r>
+              <w:rPr>
+                <w:rFonts w:ascii="Calibri" w:hAnsi="Calibri"/>
+                <w:b w:val="0"/>
+                <w:sz w:val="20"/>
+              </w:rPr>
+              <w:t>Низкая</w:t>
+            </w:r>
+          </w:p>
+        </w:tc>
+        <w:tc>
+          <w:tcPr>
+            <w:tcW w:type="dxa" w:w="2016"/>
+            <w:vAlign w:val="center"/>
+          </w:tcPr>
+          <w:p>
+            <w:pPr>
+              <w:spacing w:after="0"/>
+            </w:pPr>
+            <w:r/>
+            <w:r>
+              <w:rPr>
+                <w:rFonts w:ascii="Calibri" w:hAnsi="Calibri"/>
+                <w:b w:val="0"/>
+                <w:sz w:val="20"/>
+              </w:rPr>
+              <w:t>Выполняется при начале работы, использует JWT.</w:t>
+            </w:r>
+          </w:p>
+        </w:tc>
+      </w:tr>
+      <w:tr>
+        <w:tc>
+          <w:tcPr>
+            <w:tcW w:type="dxa" w:w="2016"/>
+            <w:vAlign w:val="center"/>
+          </w:tcPr>
+          <w:p>
+            <w:pPr>
+              <w:spacing w:after="0"/>
+            </w:pPr>
+            <w:r/>
+            <w:r>
+              <w:rPr>
+                <w:rFonts w:ascii="Calibri" w:hAnsi="Calibri"/>
+                <w:b w:val="0"/>
+                <w:sz w:val="20"/>
+              </w:rPr>
+              <w:t>Регистрация инцидента</w:t>
+            </w:r>
+          </w:p>
+        </w:tc>
+        <w:tc>
+          <w:tcPr>
+            <w:tcW w:type="dxa" w:w="2016"/>
+            <w:vAlign w:val="center"/>
+          </w:tcPr>
+          <w:p>
+            <w:pPr>
+              <w:spacing w:after="0"/>
+            </w:pPr>
+            <w:r/>
+            <w:r>
+              <w:rPr>
+                <w:rFonts w:ascii="Calibri" w:hAnsi="Calibri"/>
+                <w:b w:val="0"/>
+                <w:sz w:val="20"/>
+              </w:rPr>
+              <w:t>Работник</w:t>
+            </w:r>
+          </w:p>
+        </w:tc>
+        <w:tc>
+          <w:tcPr>
+            <w:tcW w:type="dxa" w:w="2016"/>
+            <w:vAlign w:val="center"/>
+          </w:tcPr>
+          <w:p>
+            <w:pPr>
+              <w:spacing w:after="0"/>
+            </w:pPr>
+            <w:r/>
+            <w:r>
+              <w:rPr>
+                <w:rFonts w:ascii="Calibri" w:hAnsi="Calibri"/>
+                <w:b w:val="0"/>
+                <w:sz w:val="20"/>
+              </w:rPr>
+              <w:t>APK</w:t>
+            </w:r>
+          </w:p>
+        </w:tc>
+        <w:tc>
+          <w:tcPr>
+            <w:tcW w:type="dxa" w:w="2016"/>
+            <w:vAlign w:val="center"/>
+          </w:tcPr>
+          <w:p>
+            <w:pPr>
+              <w:spacing w:after="0"/>
+            </w:pPr>
+            <w:r/>
+            <w:r>
+              <w:rPr>
+                <w:rFonts w:ascii="Calibri" w:hAnsi="Calibri"/>
+                <w:b w:val="0"/>
+                <w:sz w:val="20"/>
+              </w:rPr>
+              <w:t>Средняя</w:t>
+            </w:r>
+          </w:p>
+        </w:tc>
+        <w:tc>
+          <w:tcPr>
+            <w:tcW w:type="dxa" w:w="2016"/>
+            <w:vAlign w:val="center"/>
+          </w:tcPr>
+          <w:p>
+            <w:pPr>
+              <w:spacing w:after="0"/>
+            </w:pPr>
+            <w:r/>
+            <w:r>
+              <w:rPr>
+                <w:rFonts w:ascii="Calibri" w:hAnsi="Calibri"/>
+                <w:b w:val="0"/>
+                <w:sz w:val="20"/>
+              </w:rPr>
+              <w:t>Главный сценарий мобильного клиента.</w:t>
+            </w:r>
+          </w:p>
+        </w:tc>
+      </w:tr>
+      <w:tr>
+        <w:tc>
+          <w:tcPr>
+            <w:tcW w:type="dxa" w:w="2016"/>
+            <w:vAlign w:val="center"/>
+          </w:tcPr>
+          <w:p>
+            <w:pPr>
+              <w:spacing w:after="0"/>
+            </w:pPr>
+            <w:r/>
+            <w:r>
+              <w:rPr>
+                <w:rFonts w:ascii="Calibri" w:hAnsi="Calibri"/>
+                <w:b w:val="0"/>
+                <w:sz w:val="20"/>
+              </w:rPr>
+              <w:t>Просмотр журнала рисков</w:t>
+            </w:r>
+          </w:p>
+        </w:tc>
+        <w:tc>
+          <w:tcPr>
+            <w:tcW w:type="dxa" w:w="2016"/>
+            <w:vAlign w:val="center"/>
+          </w:tcPr>
+          <w:p>
+            <w:pPr>
+              <w:spacing w:after="0"/>
+            </w:pPr>
+            <w:r/>
+            <w:r>
+              <w:rPr>
+                <w:rFonts w:ascii="Calibri" w:hAnsi="Calibri"/>
+                <w:b w:val="0"/>
+                <w:sz w:val="20"/>
+              </w:rPr>
+              <w:t>Риск-менеджер</w:t>
+            </w:r>
+          </w:p>
+        </w:tc>
+        <w:tc>
+          <w:tcPr>
+            <w:tcW w:type="dxa" w:w="2016"/>
+            <w:vAlign w:val="center"/>
+          </w:tcPr>
+          <w:p>
+            <w:pPr>
+              <w:spacing w:after="0"/>
+            </w:pPr>
+            <w:r/>
+            <w:r>
+              <w:rPr>
+                <w:rFonts w:ascii="Calibri" w:hAnsi="Calibri"/>
+                <w:b w:val="0"/>
+                <w:sz w:val="20"/>
+              </w:rPr>
+              <w:t>Web</w:t>
+            </w:r>
+          </w:p>
+        </w:tc>
+        <w:tc>
+          <w:tcPr>
+            <w:tcW w:type="dxa" w:w="2016"/>
+            <w:vAlign w:val="center"/>
+          </w:tcPr>
+          <w:p>
+            <w:pPr>
+              <w:spacing w:after="0"/>
+            </w:pPr>
+            <w:r/>
+            <w:r>
+              <w:rPr>
+                <w:rFonts w:ascii="Calibri" w:hAnsi="Calibri"/>
+                <w:b w:val="0"/>
+                <w:sz w:val="20"/>
+              </w:rPr>
+              <w:t>Высокая</w:t>
+            </w:r>
+          </w:p>
+        </w:tc>
+        <w:tc>
+          <w:tcPr>
+            <w:tcW w:type="dxa" w:w="2016"/>
+            <w:vAlign w:val="center"/>
+          </w:tcPr>
+          <w:p>
+            <w:pPr>
+              <w:spacing w:after="0"/>
+            </w:pPr>
+            <w:r/>
+            <w:r>
+              <w:rPr>
+                <w:rFonts w:ascii="Calibri" w:hAnsi="Calibri"/>
+                <w:b w:val="0"/>
+                <w:sz w:val="20"/>
+              </w:rPr>
+              <w:t>Один из самых частых read-запросов.</w:t>
+            </w:r>
+          </w:p>
+        </w:tc>
+      </w:tr>
+      <w:tr>
+        <w:tc>
+          <w:tcPr>
+            <w:tcW w:type="dxa" w:w="2016"/>
+            <w:vAlign w:val="center"/>
+          </w:tcPr>
+          <w:p>
+            <w:pPr>
+              <w:spacing w:after="0"/>
+            </w:pPr>
+            <w:r/>
+            <w:r>
+              <w:rPr>
+                <w:rFonts w:ascii="Calibri" w:hAnsi="Calibri"/>
+                <w:b w:val="0"/>
+                <w:sz w:val="20"/>
+              </w:rPr>
+              <w:t>Создание риска из инцидента</w:t>
+            </w:r>
+          </w:p>
+        </w:tc>
+        <w:tc>
+          <w:tcPr>
+            <w:tcW w:type="dxa" w:w="2016"/>
+            <w:vAlign w:val="center"/>
+          </w:tcPr>
+          <w:p>
+            <w:pPr>
+              <w:spacing w:after="0"/>
+            </w:pPr>
+            <w:r/>
+            <w:r>
+              <w:rPr>
+                <w:rFonts w:ascii="Calibri" w:hAnsi="Calibri"/>
+                <w:b w:val="0"/>
+                <w:sz w:val="20"/>
+              </w:rPr>
+              <w:t>Риск-менеджер</w:t>
+            </w:r>
+          </w:p>
+        </w:tc>
+        <w:tc>
+          <w:tcPr>
+            <w:tcW w:type="dxa" w:w="2016"/>
+            <w:vAlign w:val="center"/>
+          </w:tcPr>
+          <w:p>
+            <w:pPr>
+              <w:spacing w:after="0"/>
+            </w:pPr>
+            <w:r/>
+            <w:r>
+              <w:rPr>
+                <w:rFonts w:ascii="Calibri" w:hAnsi="Calibri"/>
+                <w:b w:val="0"/>
+                <w:sz w:val="20"/>
+              </w:rPr>
+              <w:t>Web</w:t>
+            </w:r>
+          </w:p>
+        </w:tc>
+        <w:tc>
+          <w:tcPr>
+            <w:tcW w:type="dxa" w:w="2016"/>
+            <w:vAlign w:val="center"/>
+          </w:tcPr>
+          <w:p>
+            <w:pPr>
+              <w:spacing w:after="0"/>
+            </w:pPr>
+            <w:r/>
+            <w:r>
+              <w:rPr>
+                <w:rFonts w:ascii="Calibri" w:hAnsi="Calibri"/>
+                <w:b w:val="0"/>
+                <w:sz w:val="20"/>
+              </w:rPr>
+              <w:t>Средняя</w:t>
+            </w:r>
+          </w:p>
+        </w:tc>
+        <w:tc>
+          <w:tcPr>
+            <w:tcW w:type="dxa" w:w="2016"/>
+            <w:vAlign w:val="center"/>
+          </w:tcPr>
+          <w:p>
+            <w:pPr>
+              <w:spacing w:after="0"/>
+            </w:pPr>
+            <w:r/>
+            <w:r>
+              <w:rPr>
+                <w:rFonts w:ascii="Calibri" w:hAnsi="Calibri"/>
+                <w:b w:val="0"/>
+                <w:sz w:val="20"/>
+              </w:rPr>
+              <w:t>Command-операция с изменением write-model.</w:t>
+            </w:r>
+          </w:p>
+        </w:tc>
+      </w:tr>
+      <w:tr>
+        <w:tc>
+          <w:tcPr>
+            <w:tcW w:type="dxa" w:w="2016"/>
+            <w:vAlign w:val="center"/>
+          </w:tcPr>
+          <w:p>
+            <w:pPr>
+              <w:spacing w:after="0"/>
+            </w:pPr>
+            <w:r/>
+            <w:r>
+              <w:rPr>
+                <w:rFonts w:ascii="Calibri" w:hAnsi="Calibri"/>
+                <w:b w:val="0"/>
+                <w:sz w:val="20"/>
+              </w:rPr>
+              <w:t>Назначение эксперта</w:t>
+            </w:r>
+          </w:p>
+        </w:tc>
+        <w:tc>
+          <w:tcPr>
+            <w:tcW w:type="dxa" w:w="2016"/>
+            <w:vAlign w:val="center"/>
+          </w:tcPr>
+          <w:p>
+            <w:pPr>
+              <w:spacing w:after="0"/>
+            </w:pPr>
+            <w:r/>
+            <w:r>
+              <w:rPr>
+                <w:rFonts w:ascii="Calibri" w:hAnsi="Calibri"/>
+                <w:b w:val="0"/>
+                <w:sz w:val="20"/>
+              </w:rPr>
+              <w:t>Риск-менеджер</w:t>
+            </w:r>
+          </w:p>
+        </w:tc>
+        <w:tc>
+          <w:tcPr>
+            <w:tcW w:type="dxa" w:w="2016"/>
+            <w:vAlign w:val="center"/>
+          </w:tcPr>
+          <w:p>
+            <w:pPr>
+              <w:spacing w:after="0"/>
+            </w:pPr>
+            <w:r/>
+            <w:r>
+              <w:rPr>
+                <w:rFonts w:ascii="Calibri" w:hAnsi="Calibri"/>
+                <w:b w:val="0"/>
+                <w:sz w:val="20"/>
+              </w:rPr>
+              <w:t>Web</w:t>
+            </w:r>
+          </w:p>
+        </w:tc>
+        <w:tc>
+          <w:tcPr>
+            <w:tcW w:type="dxa" w:w="2016"/>
+            <w:vAlign w:val="center"/>
+          </w:tcPr>
+          <w:p>
+            <w:pPr>
+              <w:spacing w:after="0"/>
+            </w:pPr>
+            <w:r/>
+            <w:r>
+              <w:rPr>
+                <w:rFonts w:ascii="Calibri" w:hAnsi="Calibri"/>
+                <w:b w:val="0"/>
+                <w:sz w:val="20"/>
+              </w:rPr>
+              <w:t>Средняя</w:t>
+            </w:r>
+          </w:p>
+        </w:tc>
+        <w:tc>
+          <w:tcPr>
+            <w:tcW w:type="dxa" w:w="2016"/>
+            <w:vAlign w:val="center"/>
+          </w:tcPr>
+          <w:p>
+            <w:pPr>
+              <w:spacing w:after="0"/>
+            </w:pPr>
+            <w:r/>
+            <w:r>
+              <w:rPr>
+                <w:rFonts w:ascii="Calibri" w:hAnsi="Calibri"/>
+                <w:b w:val="0"/>
+                <w:sz w:val="20"/>
+              </w:rPr>
+              <w:t>Требуется перед переводом риска в работу.</w:t>
+            </w:r>
+          </w:p>
+        </w:tc>
+      </w:tr>
+      <w:tr>
+        <w:tc>
+          <w:tcPr>
+            <w:tcW w:type="dxa" w:w="2016"/>
+            <w:vAlign w:val="center"/>
+          </w:tcPr>
+          <w:p>
+            <w:pPr>
+              <w:spacing w:after="0"/>
+            </w:pPr>
+            <w:r/>
+            <w:r>
+              <w:rPr>
+                <w:rFonts w:ascii="Calibri" w:hAnsi="Calibri"/>
+                <w:b w:val="0"/>
+                <w:sz w:val="20"/>
+              </w:rPr>
+              <w:t>Отправка оценки</w:t>
+            </w:r>
+          </w:p>
+        </w:tc>
+        <w:tc>
+          <w:tcPr>
+            <w:tcW w:type="dxa" w:w="2016"/>
+            <w:vAlign w:val="center"/>
+          </w:tcPr>
+          <w:p>
+            <w:pPr>
+              <w:spacing w:after="0"/>
+            </w:pPr>
+            <w:r/>
+            <w:r>
+              <w:rPr>
+                <w:rFonts w:ascii="Calibri" w:hAnsi="Calibri"/>
+                <w:b w:val="0"/>
+                <w:sz w:val="20"/>
+              </w:rPr>
+              <w:t>Эксперт</w:t>
+            </w:r>
+          </w:p>
+        </w:tc>
+        <w:tc>
+          <w:tcPr>
+            <w:tcW w:type="dxa" w:w="2016"/>
+            <w:vAlign w:val="center"/>
+          </w:tcPr>
+          <w:p>
+            <w:pPr>
+              <w:spacing w:after="0"/>
+            </w:pPr>
+            <w:r/>
+            <w:r>
+              <w:rPr>
+                <w:rFonts w:ascii="Calibri" w:hAnsi="Calibri"/>
+                <w:b w:val="0"/>
+                <w:sz w:val="20"/>
+              </w:rPr>
+              <w:t>Desktop</w:t>
+            </w:r>
+          </w:p>
+        </w:tc>
+        <w:tc>
+          <w:tcPr>
+            <w:tcW w:type="dxa" w:w="2016"/>
+            <w:vAlign w:val="center"/>
+          </w:tcPr>
+          <w:p>
+            <w:pPr>
+              <w:spacing w:after="0"/>
+            </w:pPr>
+            <w:r/>
+            <w:r>
+              <w:rPr>
+                <w:rFonts w:ascii="Calibri" w:hAnsi="Calibri"/>
+                <w:b w:val="0"/>
+                <w:sz w:val="20"/>
+              </w:rPr>
+              <w:t>Средняя</w:t>
+            </w:r>
+          </w:p>
+        </w:tc>
+        <w:tc>
+          <w:tcPr>
+            <w:tcW w:type="dxa" w:w="2016"/>
+            <w:vAlign w:val="center"/>
+          </w:tcPr>
+          <w:p>
+            <w:pPr>
+              <w:spacing w:after="0"/>
+            </w:pPr>
+            <w:r/>
+            <w:r>
+              <w:rPr>
+                <w:rFonts w:ascii="Calibri" w:hAnsi="Calibri"/>
+                <w:b w:val="0"/>
+                <w:sz w:val="20"/>
+              </w:rPr>
+              <w:t>Command-операция, создает Assessment и domain event.</w:t>
+            </w:r>
+          </w:p>
+        </w:tc>
+      </w:tr>
+      <w:tr>
+        <w:tc>
+          <w:tcPr>
+            <w:tcW w:type="dxa" w:w="2016"/>
+            <w:vAlign w:val="center"/>
+          </w:tcPr>
+          <w:p>
+            <w:pPr>
+              <w:spacing w:after="0"/>
+            </w:pPr>
+            <w:r/>
+            <w:r>
+              <w:rPr>
+                <w:rFonts w:ascii="Calibri" w:hAnsi="Calibri"/>
+                <w:b w:val="0"/>
+                <w:sz w:val="20"/>
+              </w:rPr>
+              <w:t>Формирование отчета</w:t>
+            </w:r>
+          </w:p>
+        </w:tc>
+        <w:tc>
+          <w:tcPr>
+            <w:tcW w:type="dxa" w:w="2016"/>
+            <w:vAlign w:val="center"/>
+          </w:tcPr>
+          <w:p>
+            <w:pPr>
+              <w:spacing w:after="0"/>
+            </w:pPr>
+            <w:r/>
+            <w:r>
+              <w:rPr>
+                <w:rFonts w:ascii="Calibri" w:hAnsi="Calibri"/>
+                <w:b w:val="0"/>
+                <w:sz w:val="20"/>
+              </w:rPr>
+              <w:t>Риск-менеджер</w:t>
+            </w:r>
+          </w:p>
+        </w:tc>
+        <w:tc>
+          <w:tcPr>
+            <w:tcW w:type="dxa" w:w="2016"/>
+            <w:vAlign w:val="center"/>
+          </w:tcPr>
+          <w:p>
+            <w:pPr>
+              <w:spacing w:after="0"/>
+            </w:pPr>
+            <w:r/>
+            <w:r>
+              <w:rPr>
+                <w:rFonts w:ascii="Calibri" w:hAnsi="Calibri"/>
+                <w:b w:val="0"/>
+                <w:sz w:val="20"/>
+              </w:rPr>
+              <w:t>Web</w:t>
+            </w:r>
+          </w:p>
+        </w:tc>
+        <w:tc>
+          <w:tcPr>
+            <w:tcW w:type="dxa" w:w="2016"/>
+            <w:vAlign w:val="center"/>
+          </w:tcPr>
+          <w:p>
+            <w:pPr>
+              <w:spacing w:after="0"/>
+            </w:pPr>
+            <w:r/>
+            <w:r>
+              <w:rPr>
+                <w:rFonts w:ascii="Calibri" w:hAnsi="Calibri"/>
+                <w:b w:val="0"/>
+                <w:sz w:val="20"/>
+              </w:rPr>
+              <w:t>Низкая</w:t>
+            </w:r>
+          </w:p>
+        </w:tc>
+        <w:tc>
+          <w:tcPr>
+            <w:tcW w:type="dxa" w:w="2016"/>
+            <w:vAlign w:val="center"/>
+          </w:tcPr>
+          <w:p>
+            <w:pPr>
+              <w:spacing w:after="0"/>
+            </w:pPr>
+            <w:r/>
+            <w:r>
+              <w:rPr>
+                <w:rFonts w:ascii="Calibri" w:hAnsi="Calibri"/>
+                <w:b w:val="0"/>
+                <w:sz w:val="20"/>
+              </w:rPr>
+              <w:t>Более тяжелая операция чтения и агрегации.</w:t>
+            </w:r>
+          </w:p>
+        </w:tc>
+      </w:tr>
+      <w:tr>
+        <w:tc>
+          <w:tcPr>
+            <w:tcW w:type="dxa" w:w="2016"/>
+            <w:vAlign w:val="center"/>
+          </w:tcPr>
+          <w:p>
+            <w:pPr>
+              <w:spacing w:after="0"/>
+            </w:pPr>
+            <w:r/>
+            <w:r>
+              <w:rPr>
+                <w:rFonts w:ascii="Calibri" w:hAnsi="Calibri"/>
+                <w:b w:val="0"/>
+                <w:sz w:val="20"/>
+              </w:rPr>
+              <w:t>Обработка очереди событий</w:t>
+            </w:r>
+          </w:p>
+        </w:tc>
+        <w:tc>
+          <w:tcPr>
+            <w:tcW w:type="dxa" w:w="2016"/>
+            <w:vAlign w:val="center"/>
+          </w:tcPr>
+          <w:p>
+            <w:pPr>
+              <w:spacing w:after="0"/>
+            </w:pPr>
+            <w:r/>
+            <w:r>
+              <w:rPr>
+                <w:rFonts w:ascii="Calibri" w:hAnsi="Calibri"/>
+                <w:b w:val="0"/>
+                <w:sz w:val="20"/>
+              </w:rPr>
+              <w:t>Система</w:t>
+            </w:r>
+          </w:p>
+        </w:tc>
+        <w:tc>
+          <w:tcPr>
+            <w:tcW w:type="dxa" w:w="2016"/>
+            <w:vAlign w:val="center"/>
+          </w:tcPr>
+          <w:p>
+            <w:pPr>
+              <w:spacing w:after="0"/>
+            </w:pPr>
+            <w:r/>
+            <w:r>
+              <w:rPr>
+                <w:rFonts w:ascii="Calibri" w:hAnsi="Calibri"/>
+                <w:b w:val="0"/>
+                <w:sz w:val="20"/>
+              </w:rPr>
+              <w:t>Web/API</w:t>
+            </w:r>
+          </w:p>
+        </w:tc>
+        <w:tc>
+          <w:tcPr>
+            <w:tcW w:type="dxa" w:w="2016"/>
+            <w:vAlign w:val="center"/>
+          </w:tcPr>
+          <w:p>
+            <w:pPr>
+              <w:spacing w:after="0"/>
+            </w:pPr>
+            <w:r/>
+            <w:r>
+              <w:rPr>
+                <w:rFonts w:ascii="Calibri" w:hAnsi="Calibri"/>
+                <w:b w:val="0"/>
+                <w:sz w:val="20"/>
+              </w:rPr>
+              <w:t>Периодическая</w:t>
+            </w:r>
+          </w:p>
+        </w:tc>
+        <w:tc>
+          <w:tcPr>
+            <w:tcW w:type="dxa" w:w="2016"/>
+            <w:vAlign w:val="center"/>
+          </w:tcPr>
+          <w:p>
+            <w:pPr>
+              <w:spacing w:after="0"/>
+            </w:pPr>
+            <w:r/>
+            <w:r>
+              <w:rPr>
+                <w:rFonts w:ascii="Calibri" w:hAnsi="Calibri"/>
+                <w:b w:val="0"/>
+                <w:sz w:val="20"/>
+              </w:rPr>
+              <w:t>В демо запускается вручную, в production может работать через worker.</w:t>
+            </w:r>
+          </w:p>
+        </w:tc>
+      </w:tr>
+    </w:tbl>
+    <w:p/>
+    <w:p>
+      <w:pPr>
+        <w:pStyle w:val="21"/>
+      </w:pPr>
+      <w:r>
+        <w:rPr>
+          <w:rFonts w:ascii="Calibri" w:hAnsi="Calibri"/>
+          <w:color w:val="0F2346"/>
+        </w:rPr>
+        <w:t>ОПИСАНИЕ СТРАТЕГИИ ПРОВЕРКИ</w:t>
+      </w:r>
+    </w:p>
+    <w:p>
+      <w:pPr>
+        <w:spacing w:after="120"/>
+      </w:pPr>
+      <w:r>
+        <w:t>Проверка проекта строится вокруг сквозных сценариев, а не только отдельных экранов. Основная цель — показать, что все клиенты работают через один backend и что роли не пересекаются по правам.</w:t>
+      </w:r>
+    </w:p>
+    <w:p>
+      <w:pPr>
+        <w:pStyle w:val="a"/>
+      </w:pPr>
+      <w:r>
+        <w:t>Проверить авторизацию: вход demo-пользователей, отказ при неверном пароле, доступ только после одобрения.</w:t>
+      </w:r>
+    </w:p>
+    <w:p>
+      <w:pPr>
+        <w:pStyle w:val="a"/>
+      </w:pPr>
+      <w:r>
+        <w:t>Проверить APK-сценарий: работник отправляет инцидент, запись появляется в web-очереди.</w:t>
+      </w:r>
+    </w:p>
+    <w:p>
+      <w:pPr>
+        <w:pStyle w:val="a"/>
+      </w:pPr>
+      <w:r>
+        <w:t>Проверить web-сценарий: риск-менеджер создает риск, назначает эксперта, переводит риск в работу.</w:t>
+      </w:r>
+    </w:p>
+    <w:p>
+      <w:pPr>
+        <w:pStyle w:val="a"/>
+      </w:pPr>
+      <w:r>
+        <w:t>Проверить desktop-сценарий: эксперт видит назначенный риск и отправляет оценку.</w:t>
+      </w:r>
+    </w:p>
+    <w:p>
+      <w:pPr>
+        <w:pStyle w:val="a"/>
+      </w:pPr>
+      <w:r>
+        <w:t>Проверить ограничения: нельзя перевести риск в ACTIVE без эксперта, нельзя менять завершенные/отмененные риски обратно в работу.</w:t>
+      </w:r>
+    </w:p>
+    <w:p>
+      <w:pPr>
+        <w:pStyle w:val="a"/>
+      </w:pPr>
+      <w:r>
+        <w:t>Проверить фоновые задачи: очередь событий обрабатывается, read-model обновляется, аудит фиксирует действия.</w:t>
+      </w:r>
+    </w:p>
+    <w:p>
+      <w:pPr>
+        <w:pStyle w:val="a"/>
+      </w:pPr>
+      <w:r>
+        <w:t>Проверить отчетность: формируется отчет и CSV-экспорт.</w:t>
+      </w:r>
+    </w:p>
+    <w:p>
+      <w:pPr>
+        <w:pStyle w:val="21"/>
+      </w:pPr>
+      <w:r>
+        <w:rPr>
+          <w:rFonts w:ascii="Calibri" w:hAnsi="Calibri"/>
+          <w:color w:val="0F2346"/>
+        </w:rPr>
+        <w:t>КОНФИГУРАЦИЯ ТЕСТОВОГО И ДЕМОНСТРАЦИОННОГО СТЕНДА</w:t>
+      </w:r>
+    </w:p>
+    <w:tbl>
+      <w:tblPr>
+        <w:tblStyle w:val="aff0"/>
+        <w:tblW w:type="auto" w:w="0"/>
+        <w:jc w:val="center"/>
+        <w:tblLook w:firstColumn="1" w:firstRow="1" w:lastColumn="0" w:lastRow="0" w:noHBand="0" w:noVBand="1" w:val="04A0"/>
+      </w:tblPr>
+      <w:tblGrid>
+        <w:gridCol w:w="3360"/>
+        <w:gridCol w:w="3360"/>
+        <w:gridCol w:w="3360"/>
+      </w:tblGrid>
+      <w:tr>
+        <w:tc>
+          <w:tcPr>
+            <w:tcW w:type="dxa" w:w="3360"/>
+            <w:vAlign w:val="center"/>
+            <w:shd w:fill="EAF2FF"/>
+          </w:tcPr>
+          <w:p>
+            <w:pPr>
+              <w:spacing w:after="0"/>
+            </w:pPr>
+            <w:r/>
+            <w:r>
+              <w:rPr>
+                <w:rFonts w:ascii="Calibri" w:hAnsi="Calibri"/>
+                <w:b/>
+                <w:sz w:val="20"/>
+              </w:rPr>
+              <w:t>Компонент</w:t>
+            </w:r>
+          </w:p>
+        </w:tc>
+        <w:tc>
+          <w:tcPr>
+            <w:tcW w:type="dxa" w:w="3360"/>
+            <w:vAlign w:val="center"/>
+            <w:shd w:fill="EAF2FF"/>
+          </w:tcPr>
+          <w:p>
+            <w:pPr>
+              <w:spacing w:after="0"/>
+            </w:pPr>
+            <w:r/>
+            <w:r>
+              <w:rPr>
+                <w:rFonts w:ascii="Calibri" w:hAnsi="Calibri"/>
+                <w:b/>
+                <w:sz w:val="20"/>
+              </w:rPr>
+              <w:t>Минимальная конфигурация</w:t>
+            </w:r>
+          </w:p>
+        </w:tc>
+        <w:tc>
+          <w:tcPr>
+            <w:tcW w:type="dxa" w:w="3360"/>
+            <w:vAlign w:val="center"/>
+            <w:shd w:fill="EAF2FF"/>
+          </w:tcPr>
+          <w:p>
+            <w:pPr>
+              <w:spacing w:after="0"/>
+            </w:pPr>
+            <w:r/>
+            <w:r>
+              <w:rPr>
+                <w:rFonts w:ascii="Calibri" w:hAnsi="Calibri"/>
+                <w:b/>
+                <w:sz w:val="20"/>
+              </w:rPr>
+              <w:t>Назначение</w:t>
+            </w:r>
+          </w:p>
+        </w:tc>
+      </w:tr>
+      <w:tr>
+        <w:tc>
+          <w:tcPr>
+            <w:tcW w:type="dxa" w:w="3360"/>
+            <w:vAlign w:val="center"/>
+          </w:tcPr>
+          <w:p>
+            <w:pPr>
+              <w:spacing w:after="0"/>
+            </w:pPr>
+            <w:r/>
+            <w:r>
+              <w:rPr>
+                <w:rFonts w:ascii="Calibri" w:hAnsi="Calibri"/>
+                <w:b w:val="0"/>
+                <w:sz w:val="20"/>
+              </w:rPr>
+              <w:t>ПК для web/API</w:t>
+            </w:r>
+          </w:p>
+        </w:tc>
+        <w:tc>
+          <w:tcPr>
+            <w:tcW w:type="dxa" w:w="3360"/>
+            <w:vAlign w:val="center"/>
+          </w:tcPr>
+          <w:p>
+            <w:pPr>
+              <w:spacing w:after="0"/>
+            </w:pPr>
+            <w:r/>
+            <w:r>
+              <w:rPr>
+                <w:rFonts w:ascii="Calibri" w:hAnsi="Calibri"/>
+                <w:b w:val="0"/>
+                <w:sz w:val="20"/>
+              </w:rPr>
+              <w:t>Windows, Python 3.11+, порт 5000</w:t>
+            </w:r>
+          </w:p>
+        </w:tc>
+        <w:tc>
+          <w:tcPr>
+            <w:tcW w:type="dxa" w:w="3360"/>
+            <w:vAlign w:val="center"/>
+          </w:tcPr>
+          <w:p>
+            <w:pPr>
+              <w:spacing w:after="0"/>
+            </w:pPr>
+            <w:r/>
+            <w:r>
+              <w:rPr>
+                <w:rFonts w:ascii="Calibri" w:hAnsi="Calibri"/>
+                <w:b w:val="0"/>
+                <w:sz w:val="20"/>
+              </w:rPr>
+              <w:t>Запуск Flask backend и web-панели.</w:t>
+            </w:r>
+          </w:p>
+        </w:tc>
+      </w:tr>
+      <w:tr>
+        <w:tc>
+          <w:tcPr>
+            <w:tcW w:type="dxa" w:w="3360"/>
+            <w:vAlign w:val="center"/>
+          </w:tcPr>
+          <w:p>
+            <w:pPr>
+              <w:spacing w:after="0"/>
+            </w:pPr>
+            <w:r/>
+            <w:r>
+              <w:rPr>
+                <w:rFonts w:ascii="Calibri" w:hAnsi="Calibri"/>
+                <w:b w:val="0"/>
+                <w:sz w:val="20"/>
+              </w:rPr>
+              <w:t>База данных</w:t>
+            </w:r>
+          </w:p>
+        </w:tc>
+        <w:tc>
+          <w:tcPr>
+            <w:tcW w:type="dxa" w:w="3360"/>
+            <w:vAlign w:val="center"/>
+          </w:tcPr>
+          <w:p>
+            <w:pPr>
+              <w:spacing w:after="0"/>
+            </w:pPr>
+            <w:r/>
+            <w:r>
+              <w:rPr>
+                <w:rFonts w:ascii="Calibri" w:hAnsi="Calibri"/>
+                <w:b w:val="0"/>
+                <w:sz w:val="20"/>
+              </w:rPr>
+              <w:t>SQLite: web/instance/riskguard_v3.db</w:t>
+            </w:r>
+          </w:p>
+        </w:tc>
+        <w:tc>
+          <w:tcPr>
+            <w:tcW w:type="dxa" w:w="3360"/>
+            <w:vAlign w:val="center"/>
+          </w:tcPr>
+          <w:p>
+            <w:pPr>
+              <w:spacing w:after="0"/>
+            </w:pPr>
+            <w:r/>
+            <w:r>
+              <w:rPr>
+                <w:rFonts w:ascii="Calibri" w:hAnsi="Calibri"/>
+                <w:b w:val="0"/>
+                <w:sz w:val="20"/>
+              </w:rPr>
+              <w:t>Демо-хранение пользователей, рисков, оценок, аудита.</w:t>
+            </w:r>
+          </w:p>
+        </w:tc>
+      </w:tr>
+      <w:tr>
+        <w:tc>
+          <w:tcPr>
+            <w:tcW w:type="dxa" w:w="3360"/>
+            <w:vAlign w:val="center"/>
+          </w:tcPr>
+          <w:p>
+            <w:pPr>
+              <w:spacing w:after="0"/>
+            </w:pPr>
+            <w:r/>
+            <w:r>
+              <w:rPr>
+                <w:rFonts w:ascii="Calibri" w:hAnsi="Calibri"/>
+                <w:b w:val="0"/>
+                <w:sz w:val="20"/>
+              </w:rPr>
+              <w:t>Desktop</w:t>
+            </w:r>
+          </w:p>
+        </w:tc>
+        <w:tc>
+          <w:tcPr>
+            <w:tcW w:type="dxa" w:w="3360"/>
+            <w:vAlign w:val="center"/>
+          </w:tcPr>
+          <w:p>
+            <w:pPr>
+              <w:spacing w:after="0"/>
+            </w:pPr>
+            <w:r/>
+            <w:r>
+              <w:rPr>
+                <w:rFonts w:ascii="Calibri" w:hAnsi="Calibri"/>
+                <w:b w:val="0"/>
+                <w:sz w:val="20"/>
+              </w:rPr>
+              <w:t>Windows + установленный EXE/MSI</w:t>
+            </w:r>
+          </w:p>
+        </w:tc>
+        <w:tc>
+          <w:tcPr>
+            <w:tcW w:type="dxa" w:w="3360"/>
+            <w:vAlign w:val="center"/>
+          </w:tcPr>
+          <w:p>
+            <w:pPr>
+              <w:spacing w:after="0"/>
+            </w:pPr>
+            <w:r/>
+            <w:r>
+              <w:rPr>
+                <w:rFonts w:ascii="Calibri" w:hAnsi="Calibri"/>
+                <w:b w:val="0"/>
+                <w:sz w:val="20"/>
+              </w:rPr>
+              <w:t>Клиент эксперта.</w:t>
+            </w:r>
+          </w:p>
+        </w:tc>
+      </w:tr>
+      <w:tr>
+        <w:tc>
+          <w:tcPr>
+            <w:tcW w:type="dxa" w:w="3360"/>
+            <w:vAlign w:val="center"/>
+          </w:tcPr>
+          <w:p>
+            <w:pPr>
+              <w:spacing w:after="0"/>
+            </w:pPr>
+            <w:r/>
+            <w:r>
+              <w:rPr>
+                <w:rFonts w:ascii="Calibri" w:hAnsi="Calibri"/>
+                <w:b w:val="0"/>
+                <w:sz w:val="20"/>
+              </w:rPr>
+              <w:t>APK</w:t>
+            </w:r>
+          </w:p>
+        </w:tc>
+        <w:tc>
+          <w:tcPr>
+            <w:tcW w:type="dxa" w:w="3360"/>
+            <w:vAlign w:val="center"/>
+          </w:tcPr>
+          <w:p>
+            <w:pPr>
+              <w:spacing w:after="0"/>
+            </w:pPr>
+            <w:r/>
+            <w:r>
+              <w:rPr>
+                <w:rFonts w:ascii="Calibri" w:hAnsi="Calibri"/>
+                <w:b w:val="0"/>
+                <w:sz w:val="20"/>
+              </w:rPr>
+              <w:t>Android/LDPlayer + RiskGuard-Worker.apk</w:t>
+            </w:r>
+          </w:p>
+        </w:tc>
+        <w:tc>
+          <w:tcPr>
+            <w:tcW w:type="dxa" w:w="3360"/>
+            <w:vAlign w:val="center"/>
+          </w:tcPr>
+          <w:p>
+            <w:pPr>
+              <w:spacing w:after="0"/>
+            </w:pPr>
+            <w:r/>
+            <w:r>
+              <w:rPr>
+                <w:rFonts w:ascii="Calibri" w:hAnsi="Calibri"/>
+                <w:b w:val="0"/>
+                <w:sz w:val="20"/>
+              </w:rPr>
+              <w:t>Клиент работника.</w:t>
+            </w:r>
+          </w:p>
+        </w:tc>
+      </w:tr>
+      <w:tr>
+        <w:tc>
+          <w:tcPr>
+            <w:tcW w:type="dxa" w:w="3360"/>
+            <w:vAlign w:val="center"/>
+          </w:tcPr>
+          <w:p>
+            <w:pPr>
+              <w:spacing w:after="0"/>
+            </w:pPr>
+            <w:r/>
+            <w:r>
+              <w:rPr>
+                <w:rFonts w:ascii="Calibri" w:hAnsi="Calibri"/>
+                <w:b w:val="0"/>
+                <w:sz w:val="20"/>
+              </w:rPr>
+              <w:t>Сеть</w:t>
+            </w:r>
+          </w:p>
+        </w:tc>
+        <w:tc>
+          <w:tcPr>
+            <w:tcW w:type="dxa" w:w="3360"/>
+            <w:vAlign w:val="center"/>
+          </w:tcPr>
+          <w:p>
+            <w:pPr>
+              <w:spacing w:after="0"/>
+            </w:pPr>
+            <w:r/>
+            <w:r>
+              <w:rPr>
+                <w:rFonts w:ascii="Calibri" w:hAnsi="Calibri"/>
+                <w:b w:val="0"/>
+                <w:sz w:val="20"/>
+              </w:rPr>
+              <w:t>Один ПК или локальная сеть</w:t>
+            </w:r>
+          </w:p>
+        </w:tc>
+        <w:tc>
+          <w:tcPr>
+            <w:tcW w:type="dxa" w:w="3360"/>
+            <w:vAlign w:val="center"/>
+          </w:tcPr>
+          <w:p>
+            <w:pPr>
+              <w:spacing w:after="0"/>
+            </w:pPr>
+            <w:r/>
+            <w:r>
+              <w:rPr>
+                <w:rFonts w:ascii="Calibri" w:hAnsi="Calibri"/>
+                <w:b w:val="0"/>
+                <w:sz w:val="20"/>
+              </w:rPr>
+              <w:t>APK указывает адрес web-сервера в настройках.</w:t>
+            </w:r>
+          </w:p>
+        </w:tc>
+      </w:tr>
+      <w:tr>
+        <w:tc>
+          <w:tcPr>
+            <w:tcW w:type="dxa" w:w="3360"/>
+            <w:vAlign w:val="center"/>
+          </w:tcPr>
+          <w:p>
+            <w:pPr>
+              <w:spacing w:after="0"/>
+            </w:pPr>
+            <w:r/>
+            <w:r>
+              <w:rPr>
+                <w:rFonts w:ascii="Calibri" w:hAnsi="Calibri"/>
+                <w:b w:val="0"/>
+                <w:sz w:val="20"/>
+              </w:rPr>
+              <w:t>GitHub</w:t>
+            </w:r>
+          </w:p>
+        </w:tc>
+        <w:tc>
+          <w:tcPr>
+            <w:tcW w:type="dxa" w:w="3360"/>
+            <w:vAlign w:val="center"/>
+          </w:tcPr>
+          <w:p>
+            <w:pPr>
+              <w:spacing w:after="0"/>
+            </w:pPr>
+            <w:r/>
+            <w:r>
+              <w:rPr>
+                <w:rFonts w:ascii="Calibri" w:hAnsi="Calibri"/>
+                <w:b w:val="0"/>
+                <w:sz w:val="20"/>
+              </w:rPr>
+              <w:t>qleroip/projectt</w:t>
+            </w:r>
+          </w:p>
+        </w:tc>
+        <w:tc>
+          <w:tcPr>
+            <w:tcW w:type="dxa" w:w="3360"/>
+            <w:vAlign w:val="center"/>
+          </w:tcPr>
+          <w:p>
+            <w:pPr>
+              <w:spacing w:after="0"/>
+            </w:pPr>
+            <w:r/>
+            <w:r>
+              <w:rPr>
+                <w:rFonts w:ascii="Calibri" w:hAnsi="Calibri"/>
+                <w:b w:val="0"/>
+                <w:sz w:val="20"/>
+              </w:rPr>
+              <w:t>Хранение кода, документации и релизных файлов.</w:t>
+            </w:r>
+          </w:p>
+        </w:tc>
+      </w:tr>
+    </w:tbl>
+    <w:p/>
+    <w:p>
+      <w:pPr>
+        <w:spacing w:after="120"/>
+      </w:pPr>
+      <w:r>
+        <w:t>Для демонстрации достаточно одного ПК: web запускается локально, desktop подключается к http://127.0.0.1:5000, APK в LDPlayer подключается к IP web-сервера, указанному в настройках приложения.</w:t>
+      </w:r>
+    </w:p>
+    <w:p>
+      <w:pPr>
+        <w:pStyle w:val="21"/>
+      </w:pPr>
+      <w:r>
+        <w:rPr>
+          <w:rFonts w:ascii="Calibri" w:hAnsi="Calibri"/>
+          <w:color w:val="0F2346"/>
+        </w:rPr>
+        <w:t>МОНИТОРИНГ И МЕТРИКИ</w:t>
+      </w:r>
+    </w:p>
+    <w:p>
+      <w:pPr>
+        <w:spacing w:after="120"/>
+      </w:pPr>
+      <w:r>
+        <w:t>В проекте есть базовая инфраструктура мониторинга на уровне приложения: audit log, api_request_metric, heatmap endpoint и состояние очереди domain_event.</w:t>
+      </w:r>
+    </w:p>
+    <w:tbl>
+      <w:tblPr>
+        <w:tblStyle w:val="aff0"/>
+        <w:tblW w:type="auto" w:w="0"/>
+        <w:jc w:val="center"/>
+        <w:tblLook w:firstColumn="1" w:firstRow="1" w:lastColumn="0" w:lastRow="0" w:noHBand="0" w:noVBand="1" w:val="04A0"/>
+      </w:tblPr>
+      <w:tblGrid>
+        <w:gridCol w:w="3360"/>
+        <w:gridCol w:w="3360"/>
+        <w:gridCol w:w="3360"/>
+      </w:tblGrid>
+      <w:tr>
+        <w:tc>
+          <w:tcPr>
+            <w:tcW w:type="dxa" w:w="3360"/>
+            <w:vAlign w:val="center"/>
+            <w:shd w:fill="EAF2FF"/>
+          </w:tcPr>
+          <w:p>
+            <w:pPr>
+              <w:spacing w:after="0"/>
+            </w:pPr>
+            <w:r/>
+            <w:r>
+              <w:rPr>
+                <w:rFonts w:ascii="Calibri" w:hAnsi="Calibri"/>
+                <w:b/>
+                <w:sz w:val="20"/>
+              </w:rPr>
+              <w:t>Метрика</w:t>
+            </w:r>
+          </w:p>
+        </w:tc>
+        <w:tc>
+          <w:tcPr>
+            <w:tcW w:type="dxa" w:w="3360"/>
+            <w:vAlign w:val="center"/>
+            <w:shd w:fill="EAF2FF"/>
+          </w:tcPr>
+          <w:p>
+            <w:pPr>
+              <w:spacing w:after="0"/>
+            </w:pPr>
+            <w:r/>
+            <w:r>
+              <w:rPr>
+                <w:rFonts w:ascii="Calibri" w:hAnsi="Calibri"/>
+                <w:b/>
+                <w:sz w:val="20"/>
+              </w:rPr>
+              <w:t>Источник</w:t>
+            </w:r>
+          </w:p>
+        </w:tc>
+        <w:tc>
+          <w:tcPr>
+            <w:tcW w:type="dxa" w:w="3360"/>
+            <w:vAlign w:val="center"/>
+            <w:shd w:fill="EAF2FF"/>
+          </w:tcPr>
+          <w:p>
+            <w:pPr>
+              <w:spacing w:after="0"/>
+            </w:pPr>
+            <w:r/>
+            <w:r>
+              <w:rPr>
+                <w:rFonts w:ascii="Calibri" w:hAnsi="Calibri"/>
+                <w:b/>
+                <w:sz w:val="20"/>
+              </w:rPr>
+              <w:t>Для чего нужна</w:t>
+            </w:r>
+          </w:p>
+        </w:tc>
+      </w:tr>
+      <w:tr>
+        <w:tc>
+          <w:tcPr>
+            <w:tcW w:type="dxa" w:w="3360"/>
+            <w:vAlign w:val="center"/>
+          </w:tcPr>
+          <w:p>
+            <w:pPr>
+              <w:spacing w:after="0"/>
+            </w:pPr>
+            <w:r/>
+            <w:r>
+              <w:rPr>
+                <w:rFonts w:ascii="Calibri" w:hAnsi="Calibri"/>
+                <w:b w:val="0"/>
+                <w:sz w:val="20"/>
+              </w:rPr>
+              <w:t>Количество API-запросов</w:t>
+            </w:r>
+          </w:p>
+        </w:tc>
+        <w:tc>
+          <w:tcPr>
+            <w:tcW w:type="dxa" w:w="3360"/>
+            <w:vAlign w:val="center"/>
+          </w:tcPr>
+          <w:p>
+            <w:pPr>
+              <w:spacing w:after="0"/>
+            </w:pPr>
+            <w:r/>
+            <w:r>
+              <w:rPr>
+                <w:rFonts w:ascii="Calibri" w:hAnsi="Calibri"/>
+                <w:b w:val="0"/>
+                <w:sz w:val="20"/>
+              </w:rPr>
+              <w:t>api_request_metric</w:t>
+            </w:r>
+          </w:p>
+        </w:tc>
+        <w:tc>
+          <w:tcPr>
+            <w:tcW w:type="dxa" w:w="3360"/>
+            <w:vAlign w:val="center"/>
+          </w:tcPr>
+          <w:p>
+            <w:pPr>
+              <w:spacing w:after="0"/>
+            </w:pPr>
+            <w:r/>
+            <w:r>
+              <w:rPr>
+                <w:rFonts w:ascii="Calibri" w:hAnsi="Calibri"/>
+                <w:b w:val="0"/>
+                <w:sz w:val="20"/>
+              </w:rPr>
+              <w:t>Понять самые частые endpoint'ы.</w:t>
+            </w:r>
+          </w:p>
+        </w:tc>
+      </w:tr>
+      <w:tr>
+        <w:tc>
+          <w:tcPr>
+            <w:tcW w:type="dxa" w:w="3360"/>
+            <w:vAlign w:val="center"/>
+          </w:tcPr>
+          <w:p>
+            <w:pPr>
+              <w:spacing w:after="0"/>
+            </w:pPr>
+            <w:r/>
+            <w:r>
+              <w:rPr>
+                <w:rFonts w:ascii="Calibri" w:hAnsi="Calibri"/>
+                <w:b w:val="0"/>
+                <w:sz w:val="20"/>
+              </w:rPr>
+              <w:t>Среднее время command-операций</w:t>
+            </w:r>
+          </w:p>
+        </w:tc>
+        <w:tc>
+          <w:tcPr>
+            <w:tcW w:type="dxa" w:w="3360"/>
+            <w:vAlign w:val="center"/>
+          </w:tcPr>
+          <w:p>
+            <w:pPr>
+              <w:spacing w:after="0"/>
+            </w:pPr>
+            <w:r/>
+            <w:r>
+              <w:rPr>
+                <w:rFonts w:ascii="Calibri" w:hAnsi="Calibri"/>
+                <w:b w:val="0"/>
+                <w:sz w:val="20"/>
+              </w:rPr>
+              <w:t>api_request_metric</w:t>
+            </w:r>
+          </w:p>
+        </w:tc>
+        <w:tc>
+          <w:tcPr>
+            <w:tcW w:type="dxa" w:w="3360"/>
+            <w:vAlign w:val="center"/>
+          </w:tcPr>
+          <w:p>
+            <w:pPr>
+              <w:spacing w:after="0"/>
+            </w:pPr>
+            <w:r/>
+            <w:r>
+              <w:rPr>
+                <w:rFonts w:ascii="Calibri" w:hAnsi="Calibri"/>
+                <w:b w:val="0"/>
+                <w:sz w:val="20"/>
+              </w:rPr>
+              <w:t>Найти тяжелые операции изменения данных.</w:t>
+            </w:r>
+          </w:p>
+        </w:tc>
+      </w:tr>
+      <w:tr>
+        <w:tc>
+          <w:tcPr>
+            <w:tcW w:type="dxa" w:w="3360"/>
+            <w:vAlign w:val="center"/>
+          </w:tcPr>
+          <w:p>
+            <w:pPr>
+              <w:spacing w:after="0"/>
+            </w:pPr>
+            <w:r/>
+            <w:r>
+              <w:rPr>
+                <w:rFonts w:ascii="Calibri" w:hAnsi="Calibri"/>
+                <w:b w:val="0"/>
+                <w:sz w:val="20"/>
+              </w:rPr>
+              <w:t>Состояние очереди событий</w:t>
+            </w:r>
+          </w:p>
+        </w:tc>
+        <w:tc>
+          <w:tcPr>
+            <w:tcW w:type="dxa" w:w="3360"/>
+            <w:vAlign w:val="center"/>
+          </w:tcPr>
+          <w:p>
+            <w:pPr>
+              <w:spacing w:after="0"/>
+            </w:pPr>
+            <w:r/>
+            <w:r>
+              <w:rPr>
+                <w:rFonts w:ascii="Calibri" w:hAnsi="Calibri"/>
+                <w:b w:val="0"/>
+                <w:sz w:val="20"/>
+              </w:rPr>
+              <w:t>domain_event</w:t>
+            </w:r>
+          </w:p>
+        </w:tc>
+        <w:tc>
+          <w:tcPr>
+            <w:tcW w:type="dxa" w:w="3360"/>
+            <w:vAlign w:val="center"/>
+          </w:tcPr>
+          <w:p>
+            <w:pPr>
+              <w:spacing w:after="0"/>
+            </w:pPr>
+            <w:r/>
+            <w:r>
+              <w:rPr>
+                <w:rFonts w:ascii="Calibri" w:hAnsi="Calibri"/>
+                <w:b w:val="0"/>
+                <w:sz w:val="20"/>
+              </w:rPr>
+              <w:t>Проверить pending/processed/failed события.</w:t>
+            </w:r>
+          </w:p>
+        </w:tc>
+      </w:tr>
+      <w:tr>
+        <w:tc>
+          <w:tcPr>
+            <w:tcW w:type="dxa" w:w="3360"/>
+            <w:vAlign w:val="center"/>
+          </w:tcPr>
+          <w:p>
+            <w:pPr>
+              <w:spacing w:after="0"/>
+            </w:pPr>
+            <w:r/>
+            <w:r>
+              <w:rPr>
+                <w:rFonts w:ascii="Calibri" w:hAnsi="Calibri"/>
+                <w:b w:val="0"/>
+                <w:sz w:val="20"/>
+              </w:rPr>
+              <w:t>Журнал действий</w:t>
+            </w:r>
+          </w:p>
+        </w:tc>
+        <w:tc>
+          <w:tcPr>
+            <w:tcW w:type="dxa" w:w="3360"/>
+            <w:vAlign w:val="center"/>
+          </w:tcPr>
+          <w:p>
+            <w:pPr>
+              <w:spacing w:after="0"/>
+            </w:pPr>
+            <w:r/>
+            <w:r>
+              <w:rPr>
+                <w:rFonts w:ascii="Calibri" w:hAnsi="Calibri"/>
+                <w:b w:val="0"/>
+                <w:sz w:val="20"/>
+              </w:rPr>
+              <w:t>audit_log</w:t>
+            </w:r>
+          </w:p>
+        </w:tc>
+        <w:tc>
+          <w:tcPr>
+            <w:tcW w:type="dxa" w:w="3360"/>
+            <w:vAlign w:val="center"/>
+          </w:tcPr>
+          <w:p>
+            <w:pPr>
+              <w:spacing w:after="0"/>
+            </w:pPr>
+            <w:r/>
+            <w:r>
+              <w:rPr>
+                <w:rFonts w:ascii="Calibri" w:hAnsi="Calibri"/>
+                <w:b w:val="0"/>
+                <w:sz w:val="20"/>
+              </w:rPr>
+              <w:t>Проверить кто и что сделал в системе.</w:t>
+            </w:r>
+          </w:p>
+        </w:tc>
+      </w:tr>
+      <w:tr>
+        <w:tc>
+          <w:tcPr>
+            <w:tcW w:type="dxa" w:w="3360"/>
+            <w:vAlign w:val="center"/>
+          </w:tcPr>
+          <w:p>
+            <w:pPr>
+              <w:spacing w:after="0"/>
+            </w:pPr>
+            <w:r/>
+            <w:r>
+              <w:rPr>
+                <w:rFonts w:ascii="Calibri" w:hAnsi="Calibri"/>
+                <w:b w:val="0"/>
+                <w:sz w:val="20"/>
+              </w:rPr>
+              <w:t>Лаг read-model</w:t>
+            </w:r>
+          </w:p>
+        </w:tc>
+        <w:tc>
+          <w:tcPr>
+            <w:tcW w:type="dxa" w:w="3360"/>
+            <w:vAlign w:val="center"/>
+          </w:tcPr>
+          <w:p>
+            <w:pPr>
+              <w:spacing w:after="0"/>
+            </w:pPr>
+            <w:r/>
+            <w:r>
+              <w:rPr>
+                <w:rFonts w:ascii="Calibri" w:hAnsi="Calibri"/>
+                <w:b w:val="0"/>
+                <w:sz w:val="20"/>
+              </w:rPr>
+              <w:t>GET /api/queries/lag</w:t>
+            </w:r>
+          </w:p>
+        </w:tc>
+        <w:tc>
+          <w:tcPr>
+            <w:tcW w:type="dxa" w:w="3360"/>
+            <w:vAlign w:val="center"/>
+          </w:tcPr>
+          <w:p>
+            <w:pPr>
+              <w:spacing w:after="0"/>
+            </w:pPr>
+            <w:r/>
+            <w:r>
+              <w:rPr>
+                <w:rFonts w:ascii="Calibri" w:hAnsi="Calibri"/>
+                <w:b w:val="0"/>
+                <w:sz w:val="20"/>
+              </w:rPr>
+              <w:t>Показать eventual consistency.</w:t>
+            </w:r>
+          </w:p>
+        </w:tc>
+      </w:tr>
+    </w:tbl>
+    <w:p/>
+    <w:p>
+      <w:pPr>
+        <w:pStyle w:val="21"/>
+      </w:pPr>
+      <w:r>
+        <w:rPr>
+          <w:rFonts w:ascii="Calibri" w:hAnsi="Calibri"/>
+          <w:color w:val="0F2346"/>
+        </w:rPr>
+        <w:t>КЛАССИФИКАЦИЯ ОШИБОК</w:t>
+      </w:r>
+    </w:p>
+    <w:tbl>
+      <w:tblPr>
+        <w:tblStyle w:val="aff0"/>
+        <w:tblW w:type="auto" w:w="0"/>
+        <w:jc w:val="center"/>
+        <w:tblLook w:firstColumn="1" w:firstRow="1" w:lastColumn="0" w:lastRow="0" w:noHBand="0" w:noVBand="1" w:val="04A0"/>
+      </w:tblPr>
+      <w:tblGrid>
+        <w:gridCol w:w="3360"/>
+        <w:gridCol w:w="3360"/>
+        <w:gridCol w:w="3360"/>
+      </w:tblGrid>
+      <w:tr>
+        <w:tc>
+          <w:tcPr>
+            <w:tcW w:type="dxa" w:w="3360"/>
+            <w:vAlign w:val="center"/>
+            <w:shd w:fill="EAF2FF"/>
+          </w:tcPr>
+          <w:p>
+            <w:pPr>
+              <w:spacing w:after="0"/>
+            </w:pPr>
+            <w:r/>
+            <w:r>
+              <w:rPr>
+                <w:rFonts w:ascii="Calibri" w:hAnsi="Calibri"/>
+                <w:b/>
+                <w:sz w:val="20"/>
+              </w:rPr>
+              <w:t>Тип ошибки</w:t>
+            </w:r>
+          </w:p>
+        </w:tc>
+        <w:tc>
+          <w:tcPr>
+            <w:tcW w:type="dxa" w:w="3360"/>
+            <w:vAlign w:val="center"/>
+            <w:shd w:fill="EAF2FF"/>
+          </w:tcPr>
+          <w:p>
+            <w:pPr>
+              <w:spacing w:after="0"/>
+            </w:pPr>
+            <w:r/>
+            <w:r>
+              <w:rPr>
+                <w:rFonts w:ascii="Calibri" w:hAnsi="Calibri"/>
+                <w:b/>
+                <w:sz w:val="20"/>
+              </w:rPr>
+              <w:t>Пример</w:t>
+            </w:r>
+          </w:p>
+        </w:tc>
+        <w:tc>
+          <w:tcPr>
+            <w:tcW w:type="dxa" w:w="3360"/>
+            <w:vAlign w:val="center"/>
+            <w:shd w:fill="EAF2FF"/>
+          </w:tcPr>
+          <w:p>
+            <w:pPr>
+              <w:spacing w:after="0"/>
+            </w:pPr>
+            <w:r/>
+            <w:r>
+              <w:rPr>
+                <w:rFonts w:ascii="Calibri" w:hAnsi="Calibri"/>
+                <w:b/>
+                <w:sz w:val="20"/>
+              </w:rPr>
+              <w:t>Ожидаемое поведение</w:t>
+            </w:r>
+          </w:p>
+        </w:tc>
+      </w:tr>
+      <w:tr>
+        <w:tc>
+          <w:tcPr>
+            <w:tcW w:type="dxa" w:w="3360"/>
+            <w:vAlign w:val="center"/>
+          </w:tcPr>
+          <w:p>
+            <w:pPr>
+              <w:spacing w:after="0"/>
+            </w:pPr>
+            <w:r/>
+            <w:r>
+              <w:rPr>
+                <w:rFonts w:ascii="Calibri" w:hAnsi="Calibri"/>
+                <w:b w:val="0"/>
+                <w:sz w:val="20"/>
+              </w:rPr>
+              <w:t>Ошибка авторизации</w:t>
+            </w:r>
+          </w:p>
+        </w:tc>
+        <w:tc>
+          <w:tcPr>
+            <w:tcW w:type="dxa" w:w="3360"/>
+            <w:vAlign w:val="center"/>
+          </w:tcPr>
+          <w:p>
+            <w:pPr>
+              <w:spacing w:after="0"/>
+            </w:pPr>
+            <w:r/>
+            <w:r>
+              <w:rPr>
+                <w:rFonts w:ascii="Calibri" w:hAnsi="Calibri"/>
+                <w:b w:val="0"/>
+                <w:sz w:val="20"/>
+              </w:rPr>
+              <w:t>Нет JWT или неверный токен</w:t>
+            </w:r>
+          </w:p>
+        </w:tc>
+        <w:tc>
+          <w:tcPr>
+            <w:tcW w:type="dxa" w:w="3360"/>
+            <w:vAlign w:val="center"/>
+          </w:tcPr>
+          <w:p>
+            <w:pPr>
+              <w:spacing w:after="0"/>
+            </w:pPr>
+            <w:r/>
+            <w:r>
+              <w:rPr>
+                <w:rFonts w:ascii="Calibri" w:hAnsi="Calibri"/>
+                <w:b w:val="0"/>
+                <w:sz w:val="20"/>
+              </w:rPr>
+              <w:t>API возвращает 401.</w:t>
+            </w:r>
+          </w:p>
+        </w:tc>
+      </w:tr>
+      <w:tr>
+        <w:tc>
+          <w:tcPr>
+            <w:tcW w:type="dxa" w:w="3360"/>
+            <w:vAlign w:val="center"/>
+          </w:tcPr>
+          <w:p>
+            <w:pPr>
+              <w:spacing w:after="0"/>
+            </w:pPr>
+            <w:r/>
+            <w:r>
+              <w:rPr>
+                <w:rFonts w:ascii="Calibri" w:hAnsi="Calibri"/>
+                <w:b w:val="0"/>
+                <w:sz w:val="20"/>
+              </w:rPr>
+              <w:t>Ошибка прав доступа</w:t>
+            </w:r>
+          </w:p>
+        </w:tc>
+        <w:tc>
+          <w:tcPr>
+            <w:tcW w:type="dxa" w:w="3360"/>
+            <w:vAlign w:val="center"/>
+          </w:tcPr>
+          <w:p>
+            <w:pPr>
+              <w:spacing w:after="0"/>
+            </w:pPr>
+            <w:r/>
+            <w:r>
+              <w:rPr>
+                <w:rFonts w:ascii="Calibri" w:hAnsi="Calibri"/>
+                <w:b w:val="0"/>
+                <w:sz w:val="20"/>
+              </w:rPr>
+              <w:t>Работник пытается управлять рисками</w:t>
+            </w:r>
+          </w:p>
+        </w:tc>
+        <w:tc>
+          <w:tcPr>
+            <w:tcW w:type="dxa" w:w="3360"/>
+            <w:vAlign w:val="center"/>
+          </w:tcPr>
+          <w:p>
+            <w:pPr>
+              <w:spacing w:after="0"/>
+            </w:pPr>
+            <w:r/>
+            <w:r>
+              <w:rPr>
+                <w:rFonts w:ascii="Calibri" w:hAnsi="Calibri"/>
+                <w:b w:val="0"/>
+                <w:sz w:val="20"/>
+              </w:rPr>
+              <w:t>API возвращает 403.</w:t>
+            </w:r>
+          </w:p>
+        </w:tc>
+      </w:tr>
+      <w:tr>
+        <w:tc>
+          <w:tcPr>
+            <w:tcW w:type="dxa" w:w="3360"/>
+            <w:vAlign w:val="center"/>
+          </w:tcPr>
+          <w:p>
+            <w:pPr>
+              <w:spacing w:after="0"/>
+            </w:pPr>
+            <w:r/>
+            <w:r>
+              <w:rPr>
+                <w:rFonts w:ascii="Calibri" w:hAnsi="Calibri"/>
+                <w:b w:val="0"/>
+                <w:sz w:val="20"/>
+              </w:rPr>
+              <w:t>Ошибка валидации</w:t>
+            </w:r>
+          </w:p>
+        </w:tc>
+        <w:tc>
+          <w:tcPr>
+            <w:tcW w:type="dxa" w:w="3360"/>
+            <w:vAlign w:val="center"/>
+          </w:tcPr>
+          <w:p>
+            <w:pPr>
+              <w:spacing w:after="0"/>
+            </w:pPr>
+            <w:r/>
+            <w:r>
+              <w:rPr>
+                <w:rFonts w:ascii="Calibri" w:hAnsi="Calibri"/>
+                <w:b w:val="0"/>
+                <w:sz w:val="20"/>
+              </w:rPr>
+              <w:t>Дата/число заполнены неверно</w:t>
+            </w:r>
+          </w:p>
+        </w:tc>
+        <w:tc>
+          <w:tcPr>
+            <w:tcW w:type="dxa" w:w="3360"/>
+            <w:vAlign w:val="center"/>
+          </w:tcPr>
+          <w:p>
+            <w:pPr>
+              <w:spacing w:after="0"/>
+            </w:pPr>
+            <w:r/>
+            <w:r>
+              <w:rPr>
+                <w:rFonts w:ascii="Calibri" w:hAnsi="Calibri"/>
+                <w:b w:val="0"/>
+                <w:sz w:val="20"/>
+              </w:rPr>
+              <w:t>API возвращает 400, данные не сохраняются.</w:t>
+            </w:r>
+          </w:p>
+        </w:tc>
+      </w:tr>
+      <w:tr>
+        <w:tc>
+          <w:tcPr>
+            <w:tcW w:type="dxa" w:w="3360"/>
+            <w:vAlign w:val="center"/>
+          </w:tcPr>
+          <w:p>
+            <w:pPr>
+              <w:spacing w:after="0"/>
+            </w:pPr>
+            <w:r/>
+            <w:r>
+              <w:rPr>
+                <w:rFonts w:ascii="Calibri" w:hAnsi="Calibri"/>
+                <w:b w:val="0"/>
+                <w:sz w:val="20"/>
+              </w:rPr>
+              <w:t>Недопустимый переход статуса</w:t>
+            </w:r>
+          </w:p>
+        </w:tc>
+        <w:tc>
+          <w:tcPr>
+            <w:tcW w:type="dxa" w:w="3360"/>
+            <w:vAlign w:val="center"/>
+          </w:tcPr>
+          <w:p>
+            <w:pPr>
+              <w:spacing w:after="0"/>
+            </w:pPr>
+            <w:r/>
+            <w:r>
+              <w:rPr>
+                <w:rFonts w:ascii="Calibri" w:hAnsi="Calibri"/>
+                <w:b w:val="0"/>
+                <w:sz w:val="20"/>
+              </w:rPr>
+              <w:t>COMPLETED -&gt; ACTIVE</w:t>
+            </w:r>
+          </w:p>
+        </w:tc>
+        <w:tc>
+          <w:tcPr>
+            <w:tcW w:type="dxa" w:w="3360"/>
+            <w:vAlign w:val="center"/>
+          </w:tcPr>
+          <w:p>
+            <w:pPr>
+              <w:spacing w:after="0"/>
+            </w:pPr>
+            <w:r/>
+            <w:r>
+              <w:rPr>
+                <w:rFonts w:ascii="Calibri" w:hAnsi="Calibri"/>
+                <w:b w:val="0"/>
+                <w:sz w:val="20"/>
+              </w:rPr>
+              <w:t>API возвращает 409.</w:t>
+            </w:r>
+          </w:p>
+        </w:tc>
+      </w:tr>
+      <w:tr>
+        <w:tc>
+          <w:tcPr>
+            <w:tcW w:type="dxa" w:w="3360"/>
+            <w:vAlign w:val="center"/>
+          </w:tcPr>
+          <w:p>
+            <w:pPr>
+              <w:spacing w:after="0"/>
+            </w:pPr>
+            <w:r/>
+            <w:r>
+              <w:rPr>
+                <w:rFonts w:ascii="Calibri" w:hAnsi="Calibri"/>
+                <w:b w:val="0"/>
+                <w:sz w:val="20"/>
+              </w:rPr>
+              <w:t>Не найден объект</w:t>
+            </w:r>
+          </w:p>
+        </w:tc>
+        <w:tc>
+          <w:tcPr>
+            <w:tcW w:type="dxa" w:w="3360"/>
+            <w:vAlign w:val="center"/>
+          </w:tcPr>
+          <w:p>
+            <w:pPr>
+              <w:spacing w:after="0"/>
+            </w:pPr>
+            <w:r/>
+            <w:r>
+              <w:rPr>
+                <w:rFonts w:ascii="Calibri" w:hAnsi="Calibri"/>
+                <w:b w:val="0"/>
+                <w:sz w:val="20"/>
+              </w:rPr>
+              <w:t>RISK-999 отсутствует</w:t>
+            </w:r>
+          </w:p>
+        </w:tc>
+        <w:tc>
+          <w:tcPr>
+            <w:tcW w:type="dxa" w:w="3360"/>
+            <w:vAlign w:val="center"/>
+          </w:tcPr>
+          <w:p>
+            <w:pPr>
+              <w:spacing w:after="0"/>
+            </w:pPr>
+            <w:r/>
+            <w:r>
+              <w:rPr>
+                <w:rFonts w:ascii="Calibri" w:hAnsi="Calibri"/>
+                <w:b w:val="0"/>
+                <w:sz w:val="20"/>
+              </w:rPr>
+              <w:t>API возвращает 404.</w:t>
+            </w:r>
+          </w:p>
+        </w:tc>
+      </w:tr>
+      <w:tr>
+        <w:tc>
+          <w:tcPr>
+            <w:tcW w:type="dxa" w:w="3360"/>
+            <w:vAlign w:val="center"/>
+          </w:tcPr>
+          <w:p>
+            <w:pPr>
+              <w:spacing w:after="0"/>
+            </w:pPr>
+            <w:r/>
+            <w:r>
+              <w:rPr>
+                <w:rFonts w:ascii="Calibri" w:hAnsi="Calibri"/>
+                <w:b w:val="0"/>
+                <w:sz w:val="20"/>
+              </w:rPr>
+              <w:t>Ошибка соединения</w:t>
+            </w:r>
+          </w:p>
+        </w:tc>
+        <w:tc>
+          <w:tcPr>
+            <w:tcW w:type="dxa" w:w="3360"/>
+            <w:vAlign w:val="center"/>
+          </w:tcPr>
+          <w:p>
+            <w:pPr>
+              <w:spacing w:after="0"/>
+            </w:pPr>
+            <w:r/>
+            <w:r>
+              <w:rPr>
+                <w:rFonts w:ascii="Calibri" w:hAnsi="Calibri"/>
+                <w:b w:val="0"/>
+                <w:sz w:val="20"/>
+              </w:rPr>
+              <w:t>APK не видит web-сервер</w:t>
+            </w:r>
+          </w:p>
+        </w:tc>
+        <w:tc>
+          <w:tcPr>
+            <w:tcW w:type="dxa" w:w="3360"/>
+            <w:vAlign w:val="center"/>
+          </w:tcPr>
+          <w:p>
+            <w:pPr>
+              <w:spacing w:after="0"/>
+            </w:pPr>
+            <w:r/>
+            <w:r>
+              <w:rPr>
+                <w:rFonts w:ascii="Calibri" w:hAnsi="Calibri"/>
+                <w:b w:val="0"/>
+                <w:sz w:val="20"/>
+              </w:rPr>
+              <w:t>Клиент показывает понятное сообщение о недоступности сервера.</w:t>
+            </w:r>
+          </w:p>
+        </w:tc>
+      </w:tr>
+      <w:tr>
+        <w:tc>
+          <w:tcPr>
+            <w:tcW w:type="dxa" w:w="3360"/>
+            <w:vAlign w:val="center"/>
+          </w:tcPr>
+          <w:p>
+            <w:pPr>
+              <w:spacing w:after="0"/>
+            </w:pPr>
+            <w:r/>
+            <w:r>
+              <w:rPr>
+                <w:rFonts w:ascii="Calibri" w:hAnsi="Calibri"/>
+                <w:b w:val="0"/>
+                <w:sz w:val="20"/>
+              </w:rPr>
+              <w:t>Ошибка очереди</w:t>
+            </w:r>
+          </w:p>
+        </w:tc>
+        <w:tc>
+          <w:tcPr>
+            <w:tcW w:type="dxa" w:w="3360"/>
+            <w:vAlign w:val="center"/>
+          </w:tcPr>
+          <w:p>
+            <w:pPr>
+              <w:spacing w:after="0"/>
+            </w:pPr>
+            <w:r/>
+            <w:r>
+              <w:rPr>
+                <w:rFonts w:ascii="Calibri" w:hAnsi="Calibri"/>
+                <w:b w:val="0"/>
+                <w:sz w:val="20"/>
+              </w:rPr>
+              <w:t>Событие не обработалось</w:t>
+            </w:r>
+          </w:p>
+        </w:tc>
+        <w:tc>
+          <w:tcPr>
+            <w:tcW w:type="dxa" w:w="3360"/>
+            <w:vAlign w:val="center"/>
+          </w:tcPr>
+          <w:p>
+            <w:pPr>
+              <w:spacing w:after="0"/>
+            </w:pPr>
+            <w:r/>
+            <w:r>
+              <w:rPr>
+                <w:rFonts w:ascii="Calibri" w:hAnsi="Calibri"/>
+                <w:b w:val="0"/>
+                <w:sz w:val="20"/>
+              </w:rPr>
+              <w:t>Событие помечается как failed или остается pending для повторной обработки.</w:t>
+            </w:r>
+          </w:p>
+        </w:tc>
+      </w:tr>
+    </w:tbl>
+    <w:p/>
+    <w:p>
+      <w:pPr>
+        <w:pStyle w:val="21"/>
+      </w:pPr>
+      <w:r>
+        <w:rPr>
+          <w:rFonts w:ascii="Calibri" w:hAnsi="Calibri"/>
+          <w:color w:val="0F2346"/>
+        </w:rPr>
+        <w:t>КАРТА ДИАГРАММ ДЛЯ ВСТАВКИ В ДОКУМЕНТАЦИЮ</w:t>
+      </w:r>
+    </w:p>
+    <w:p>
+      <w:pPr>
+        <w:spacing w:after="120"/>
+      </w:pPr>
+      <w:r>
+        <w:t>Диаграммы подготовлены в PlantUML и находятся в папке docs/diagrams. Их можно сгенерировать в PNG/SVG и вставить в соответствующие разделы документации.</w:t>
+      </w:r>
+    </w:p>
+    <w:tbl>
+      <w:tblPr>
+        <w:tblStyle w:val="aff0"/>
+        <w:tblW w:type="auto" w:w="0"/>
+        <w:jc w:val="center"/>
+        <w:tblLook w:firstColumn="1" w:firstRow="1" w:lastColumn="0" w:lastRow="0" w:noHBand="0" w:noVBand="1" w:val="04A0"/>
+      </w:tblPr>
+      <w:tblGrid>
+        <w:gridCol w:w="2520"/>
+        <w:gridCol w:w="2520"/>
+        <w:gridCol w:w="2520"/>
+        <w:gridCol w:w="2520"/>
+      </w:tblGrid>
+      <w:tr>
+        <w:tc>
+          <w:tcPr>
+            <w:tcW w:type="dxa" w:w="2520"/>
+            <w:vAlign w:val="center"/>
+            <w:shd w:fill="EAF2FF"/>
+          </w:tcPr>
+          <w:p>
+            <w:pPr>
+              <w:spacing w:after="0"/>
+            </w:pPr>
+            <w:r/>
+            <w:r>
+              <w:rPr>
+                <w:rFonts w:ascii="Calibri" w:hAnsi="Calibri"/>
+                <w:b/>
+                <w:sz w:val="20"/>
+              </w:rPr>
+              <w:t>Файл</w:t>
+            </w:r>
+          </w:p>
+        </w:tc>
+        <w:tc>
+          <w:tcPr>
+            <w:tcW w:type="dxa" w:w="2520"/>
+            <w:vAlign w:val="center"/>
+            <w:shd w:fill="EAF2FF"/>
+          </w:tcPr>
+          <w:p>
+            <w:pPr>
+              <w:spacing w:after="0"/>
+            </w:pPr>
+            <w:r/>
+            <w:r>
+              <w:rPr>
+                <w:rFonts w:ascii="Calibri" w:hAnsi="Calibri"/>
+                <w:b/>
+                <w:sz w:val="20"/>
+              </w:rPr>
+              <w:t>Тип</w:t>
+            </w:r>
+          </w:p>
+        </w:tc>
+        <w:tc>
+          <w:tcPr>
+            <w:tcW w:type="dxa" w:w="2520"/>
+            <w:vAlign w:val="center"/>
+            <w:shd w:fill="EAF2FF"/>
+          </w:tcPr>
+          <w:p>
+            <w:pPr>
+              <w:spacing w:after="0"/>
+            </w:pPr>
+            <w:r/>
+            <w:r>
+              <w:rPr>
+                <w:rFonts w:ascii="Calibri" w:hAnsi="Calibri"/>
+                <w:b/>
+                <w:sz w:val="20"/>
+              </w:rPr>
+              <w:t>Куда вставить</w:t>
+            </w:r>
+          </w:p>
+        </w:tc>
+        <w:tc>
+          <w:tcPr>
+            <w:tcW w:type="dxa" w:w="2520"/>
+            <w:vAlign w:val="center"/>
+            <w:shd w:fill="EAF2FF"/>
+          </w:tcPr>
+          <w:p>
+            <w:pPr>
+              <w:spacing w:after="0"/>
+            </w:pPr>
+            <w:r/>
+            <w:r>
+              <w:rPr>
+                <w:rFonts w:ascii="Calibri" w:hAnsi="Calibri"/>
+                <w:b/>
+                <w:sz w:val="20"/>
+              </w:rPr>
+              <w:t>Что показывает</w:t>
+            </w:r>
+          </w:p>
+        </w:tc>
+      </w:tr>
+      <w:tr>
+        <w:tc>
+          <w:tcPr>
+            <w:tcW w:type="dxa" w:w="2520"/>
+            <w:vAlign w:val="center"/>
+          </w:tcPr>
+          <w:p>
+            <w:pPr>
+              <w:spacing w:after="0"/>
+            </w:pPr>
+            <w:r/>
+            <w:r>
+              <w:rPr>
+                <w:rFonts w:ascii="Calibri" w:hAnsi="Calibri"/>
+                <w:b w:val="0"/>
+                <w:sz w:val="20"/>
+              </w:rPr>
+              <w:t>docs/diagrams/use-case.puml</w:t>
+            </w:r>
+          </w:p>
+        </w:tc>
+        <w:tc>
+          <w:tcPr>
+            <w:tcW w:type="dxa" w:w="2520"/>
+            <w:vAlign w:val="center"/>
+          </w:tcPr>
+          <w:p>
+            <w:pPr>
+              <w:spacing w:after="0"/>
+            </w:pPr>
+            <w:r/>
+            <w:r>
+              <w:rPr>
+                <w:rFonts w:ascii="Calibri" w:hAnsi="Calibri"/>
+                <w:b w:val="0"/>
+                <w:sz w:val="20"/>
+              </w:rPr>
+              <w:t>Use Case</w:t>
+            </w:r>
+          </w:p>
+        </w:tc>
+        <w:tc>
+          <w:tcPr>
+            <w:tcW w:type="dxa" w:w="2520"/>
+            <w:vAlign w:val="center"/>
+          </w:tcPr>
+          <w:p>
+            <w:pPr>
+              <w:spacing w:after="0"/>
+            </w:pPr>
+            <w:r/>
+            <w:r>
+              <w:rPr>
+                <w:rFonts w:ascii="Calibri" w:hAnsi="Calibri"/>
+                <w:b w:val="0"/>
+                <w:sz w:val="20"/>
+              </w:rPr>
+              <w:t>После раздела 'Роли и сценарии использования'</w:t>
+            </w:r>
+          </w:p>
+        </w:tc>
+        <w:tc>
+          <w:tcPr>
+            <w:tcW w:type="dxa" w:w="2520"/>
+            <w:vAlign w:val="center"/>
+          </w:tcPr>
+          <w:p>
+            <w:pPr>
+              <w:spacing w:after="0"/>
+            </w:pPr>
+            <w:r/>
+            <w:r>
+              <w:rPr>
+                <w:rFonts w:ascii="Calibri" w:hAnsi="Calibri"/>
+                <w:b w:val="0"/>
+                <w:sz w:val="20"/>
+              </w:rPr>
+              <w:t>Какие действия доступны работнику, менеджеру, эксперту и администратору.</w:t>
+            </w:r>
+          </w:p>
+        </w:tc>
+      </w:tr>
+      <w:tr>
+        <w:tc>
+          <w:tcPr>
+            <w:tcW w:type="dxa" w:w="2520"/>
+            <w:vAlign w:val="center"/>
+          </w:tcPr>
+          <w:p>
+            <w:pPr>
+              <w:spacing w:after="0"/>
+            </w:pPr>
+            <w:r/>
+            <w:r>
+              <w:rPr>
+                <w:rFonts w:ascii="Calibri" w:hAnsi="Calibri"/>
+                <w:b w:val="0"/>
+                <w:sz w:val="20"/>
+              </w:rPr>
+              <w:t>docs/diagrams/idef0-context.puml</w:t>
+            </w:r>
+          </w:p>
+        </w:tc>
+        <w:tc>
+          <w:tcPr>
+            <w:tcW w:type="dxa" w:w="2520"/>
+            <w:vAlign w:val="center"/>
+          </w:tcPr>
+          <w:p>
+            <w:pPr>
+              <w:spacing w:after="0"/>
+            </w:pPr>
+            <w:r/>
+            <w:r>
+              <w:rPr>
+                <w:rFonts w:ascii="Calibri" w:hAnsi="Calibri"/>
+                <w:b w:val="0"/>
+                <w:sz w:val="20"/>
+              </w:rPr>
+              <w:t>IDEF0 A-0</w:t>
+            </w:r>
+          </w:p>
+        </w:tc>
+        <w:tc>
+          <w:tcPr>
+            <w:tcW w:type="dxa" w:w="2520"/>
+            <w:vAlign w:val="center"/>
+          </w:tcPr>
+          <w:p>
+            <w:pPr>
+              <w:spacing w:after="0"/>
+            </w:pPr>
+            <w:r/>
+            <w:r>
+              <w:rPr>
+                <w:rFonts w:ascii="Calibri" w:hAnsi="Calibri"/>
+                <w:b w:val="0"/>
+                <w:sz w:val="20"/>
+              </w:rPr>
+              <w:t>После раздела 'Архитектура системы'</w:t>
+            </w:r>
+          </w:p>
+        </w:tc>
+        <w:tc>
+          <w:tcPr>
+            <w:tcW w:type="dxa" w:w="2520"/>
+            <w:vAlign w:val="center"/>
+          </w:tcPr>
+          <w:p>
+            <w:pPr>
+              <w:spacing w:after="0"/>
+            </w:pPr>
+            <w:r/>
+            <w:r>
+              <w:rPr>
+                <w:rFonts w:ascii="Calibri" w:hAnsi="Calibri"/>
+                <w:b w:val="0"/>
+                <w:sz w:val="20"/>
+              </w:rPr>
+              <w:t>Входы, управления, механизмы и выходы процесса риск-менеджмента.</w:t>
+            </w:r>
+          </w:p>
+        </w:tc>
+      </w:tr>
+      <w:tr>
+        <w:tc>
+          <w:tcPr>
+            <w:tcW w:type="dxa" w:w="2520"/>
+            <w:vAlign w:val="center"/>
+          </w:tcPr>
+          <w:p>
+            <w:pPr>
+              <w:spacing w:after="0"/>
+            </w:pPr>
+            <w:r/>
+            <w:r>
+              <w:rPr>
+                <w:rFonts w:ascii="Calibri" w:hAnsi="Calibri"/>
+                <w:b w:val="0"/>
+                <w:sz w:val="20"/>
+              </w:rPr>
+              <w:t>docs/diagrams/idef0-decomposition.puml</w:t>
+            </w:r>
+          </w:p>
+        </w:tc>
+        <w:tc>
+          <w:tcPr>
+            <w:tcW w:type="dxa" w:w="2520"/>
+            <w:vAlign w:val="center"/>
+          </w:tcPr>
+          <w:p>
+            <w:pPr>
+              <w:spacing w:after="0"/>
+            </w:pPr>
+            <w:r/>
+            <w:r>
+              <w:rPr>
+                <w:rFonts w:ascii="Calibri" w:hAnsi="Calibri"/>
+                <w:b w:val="0"/>
+                <w:sz w:val="20"/>
+              </w:rPr>
+              <w:t>IDEF0 A0</w:t>
+            </w:r>
+          </w:p>
+        </w:tc>
+        <w:tc>
+          <w:tcPr>
+            <w:tcW w:type="dxa" w:w="2520"/>
+            <w:vAlign w:val="center"/>
+          </w:tcPr>
+          <w:p>
+            <w:pPr>
+              <w:spacing w:after="0"/>
+            </w:pPr>
+            <w:r/>
+            <w:r>
+              <w:rPr>
+                <w:rFonts w:ascii="Calibri" w:hAnsi="Calibri"/>
+                <w:b w:val="0"/>
+                <w:sz w:val="20"/>
+              </w:rPr>
+              <w:t>После контекстной диаграммы</w:t>
+            </w:r>
+          </w:p>
+        </w:tc>
+        <w:tc>
+          <w:tcPr>
+            <w:tcW w:type="dxa" w:w="2520"/>
+            <w:vAlign w:val="center"/>
+          </w:tcPr>
+          <w:p>
+            <w:pPr>
+              <w:spacing w:after="0"/>
+            </w:pPr>
+            <w:r/>
+            <w:r>
+              <w:rPr>
+                <w:rFonts w:ascii="Calibri" w:hAnsi="Calibri"/>
+                <w:b w:val="0"/>
+                <w:sz w:val="20"/>
+              </w:rPr>
+              <w:t>Декомпозиция процесса: инцидент, риск, эксперт, оценка, отчет.</w:t>
+            </w:r>
+          </w:p>
+        </w:tc>
+      </w:tr>
+      <w:tr>
+        <w:tc>
+          <w:tcPr>
+            <w:tcW w:type="dxa" w:w="2520"/>
+            <w:vAlign w:val="center"/>
+          </w:tcPr>
+          <w:p>
+            <w:pPr>
+              <w:spacing w:after="0"/>
+            </w:pPr>
+            <w:r/>
+            <w:r>
+              <w:rPr>
+                <w:rFonts w:ascii="Calibri" w:hAnsi="Calibri"/>
+                <w:b w:val="0"/>
+                <w:sz w:val="20"/>
+              </w:rPr>
+              <w:t>docs/diagrams/sequence-risk-processing.puml</w:t>
+            </w:r>
+          </w:p>
+        </w:tc>
+        <w:tc>
+          <w:tcPr>
+            <w:tcW w:type="dxa" w:w="2520"/>
+            <w:vAlign w:val="center"/>
+          </w:tcPr>
+          <w:p>
+            <w:pPr>
+              <w:spacing w:after="0"/>
+            </w:pPr>
+            <w:r/>
+            <w:r>
+              <w:rPr>
+                <w:rFonts w:ascii="Calibri" w:hAnsi="Calibri"/>
+                <w:b w:val="0"/>
+                <w:sz w:val="20"/>
+              </w:rPr>
+              <w:t>Sequence</w:t>
+            </w:r>
+          </w:p>
+        </w:tc>
+        <w:tc>
+          <w:tcPr>
+            <w:tcW w:type="dxa" w:w="2520"/>
+            <w:vAlign w:val="center"/>
+          </w:tcPr>
+          <w:p>
+            <w:pPr>
+              <w:spacing w:after="0"/>
+            </w:pPr>
+            <w:r/>
+            <w:r>
+              <w:rPr>
+                <w:rFonts w:ascii="Calibri" w:hAnsi="Calibri"/>
+                <w:b w:val="0"/>
+                <w:sz w:val="20"/>
+              </w:rPr>
+              <w:t>После раздела 'Описание системы'</w:t>
+            </w:r>
+          </w:p>
+        </w:tc>
+        <w:tc>
+          <w:tcPr>
+            <w:tcW w:type="dxa" w:w="2520"/>
+            <w:vAlign w:val="center"/>
+          </w:tcPr>
+          <w:p>
+            <w:pPr>
+              <w:spacing w:after="0"/>
+            </w:pPr>
+            <w:r/>
+            <w:r>
+              <w:rPr>
+                <w:rFonts w:ascii="Calibri" w:hAnsi="Calibri"/>
+                <w:b w:val="0"/>
+                <w:sz w:val="20"/>
+              </w:rPr>
+              <w:t>Сквозной сценарий от APK до desktop-оценки.</w:t>
+            </w:r>
+          </w:p>
+        </w:tc>
+      </w:tr>
+      <w:tr>
+        <w:tc>
+          <w:tcPr>
+            <w:tcW w:type="dxa" w:w="2520"/>
+            <w:vAlign w:val="center"/>
+          </w:tcPr>
+          <w:p>
+            <w:pPr>
+              <w:spacing w:after="0"/>
+            </w:pPr>
+            <w:r/>
+            <w:r>
+              <w:rPr>
+                <w:rFonts w:ascii="Calibri" w:hAnsi="Calibri"/>
+                <w:b w:val="0"/>
+                <w:sz w:val="20"/>
+              </w:rPr>
+              <w:t>docs/diagrams/er-model.puml</w:t>
+            </w:r>
+          </w:p>
+        </w:tc>
+        <w:tc>
+          <w:tcPr>
+            <w:tcW w:type="dxa" w:w="2520"/>
+            <w:vAlign w:val="center"/>
+          </w:tcPr>
+          <w:p>
+            <w:pPr>
+              <w:spacing w:after="0"/>
+            </w:pPr>
+            <w:r/>
+            <w:r>
+              <w:rPr>
+                <w:rFonts w:ascii="Calibri" w:hAnsi="Calibri"/>
+                <w:b w:val="0"/>
+                <w:sz w:val="20"/>
+              </w:rPr>
+              <w:t>ER</w:t>
+            </w:r>
+          </w:p>
+        </w:tc>
+        <w:tc>
+          <w:tcPr>
+            <w:tcW w:type="dxa" w:w="2520"/>
+            <w:vAlign w:val="center"/>
+          </w:tcPr>
+          <w:p>
+            <w:pPr>
+              <w:spacing w:after="0"/>
+            </w:pPr>
+            <w:r/>
+            <w:r>
+              <w:rPr>
+                <w:rFonts w:ascii="Calibri" w:hAnsi="Calibri"/>
+                <w:b w:val="0"/>
+                <w:sz w:val="20"/>
+              </w:rPr>
+              <w:t>После раздела 'Модель данных'</w:t>
+            </w:r>
+          </w:p>
+        </w:tc>
+        <w:tc>
+          <w:tcPr>
+            <w:tcW w:type="dxa" w:w="2520"/>
+            <w:vAlign w:val="center"/>
+          </w:tcPr>
+          <w:p>
+            <w:pPr>
+              <w:spacing w:after="0"/>
+            </w:pPr>
+            <w:r/>
+            <w:r>
+              <w:rPr>
+                <w:rFonts w:ascii="Calibri" w:hAnsi="Calibri"/>
+                <w:b w:val="0"/>
+                <w:sz w:val="20"/>
+              </w:rPr>
+              <w:t>Основные таблицы и связи базы.</w:t>
+            </w:r>
+          </w:p>
+        </w:tc>
+      </w:tr>
+      <w:tr>
+        <w:tc>
+          <w:tcPr>
+            <w:tcW w:type="dxa" w:w="2520"/>
+            <w:vAlign w:val="center"/>
+          </w:tcPr>
+          <w:p>
+            <w:pPr>
+              <w:spacing w:after="0"/>
+            </w:pPr>
+            <w:r/>
+            <w:r>
+              <w:rPr>
+                <w:rFonts w:ascii="Calibri" w:hAnsi="Calibri"/>
+                <w:b w:val="0"/>
+                <w:sz w:val="20"/>
+              </w:rPr>
+              <w:t>docs/diagrams/risk-lifecycle.puml</w:t>
+            </w:r>
+          </w:p>
+        </w:tc>
+        <w:tc>
+          <w:tcPr>
+            <w:tcW w:type="dxa" w:w="2520"/>
+            <w:vAlign w:val="center"/>
+          </w:tcPr>
+          <w:p>
+            <w:pPr>
+              <w:spacing w:after="0"/>
+            </w:pPr>
+            <w:r/>
+            <w:r>
+              <w:rPr>
+                <w:rFonts w:ascii="Calibri" w:hAnsi="Calibri"/>
+                <w:b w:val="0"/>
+                <w:sz w:val="20"/>
+              </w:rPr>
+              <w:t>State</w:t>
+            </w:r>
+          </w:p>
+        </w:tc>
+        <w:tc>
+          <w:tcPr>
+            <w:tcW w:type="dxa" w:w="2520"/>
+            <w:vAlign w:val="center"/>
+          </w:tcPr>
+          <w:p>
+            <w:pPr>
+              <w:spacing w:after="0"/>
+            </w:pPr>
+            <w:r/>
+            <w:r>
+              <w:rPr>
+                <w:rFonts w:ascii="Calibri" w:hAnsi="Calibri"/>
+                <w:b w:val="0"/>
+                <w:sz w:val="20"/>
+              </w:rPr>
+              <w:t>После жизненного цикла риска</w:t>
+            </w:r>
+          </w:p>
+        </w:tc>
+        <w:tc>
+          <w:tcPr>
+            <w:tcW w:type="dxa" w:w="2520"/>
+            <w:vAlign w:val="center"/>
+          </w:tcPr>
+          <w:p>
+            <w:pPr>
+              <w:spacing w:after="0"/>
+            </w:pPr>
+            <w:r/>
+            <w:r>
+              <w:rPr>
+                <w:rFonts w:ascii="Calibri" w:hAnsi="Calibri"/>
+                <w:b w:val="0"/>
+                <w:sz w:val="20"/>
+              </w:rPr>
+              <w:t>Разрешенные и запрещенные переходы статусов.</w:t>
+            </w:r>
+          </w:p>
+        </w:tc>
+      </w:tr>
+      <w:tr>
+        <w:tc>
+          <w:tcPr>
+            <w:tcW w:type="dxa" w:w="2520"/>
+            <w:vAlign w:val="center"/>
+          </w:tcPr>
+          <w:p>
+            <w:pPr>
+              <w:spacing w:after="0"/>
+            </w:pPr>
+            <w:r/>
+            <w:r>
+              <w:rPr>
+                <w:rFonts w:ascii="Calibri" w:hAnsi="Calibri"/>
+                <w:b w:val="0"/>
+                <w:sz w:val="20"/>
+              </w:rPr>
+              <w:t>docs/diagrams/cqrs-event-flow.puml</w:t>
+            </w:r>
+          </w:p>
+        </w:tc>
+        <w:tc>
+          <w:tcPr>
+            <w:tcW w:type="dxa" w:w="2520"/>
+            <w:vAlign w:val="center"/>
+          </w:tcPr>
+          <w:p>
+            <w:pPr>
+              <w:spacing w:after="0"/>
+            </w:pPr>
+            <w:r/>
+            <w:r>
+              <w:rPr>
+                <w:rFonts w:ascii="Calibri" w:hAnsi="Calibri"/>
+                <w:b w:val="0"/>
+                <w:sz w:val="20"/>
+              </w:rPr>
+              <w:t>Component</w:t>
+            </w:r>
+          </w:p>
+        </w:tc>
+        <w:tc>
+          <w:tcPr>
+            <w:tcW w:type="dxa" w:w="2520"/>
+            <w:vAlign w:val="center"/>
+          </w:tcPr>
+          <w:p>
+            <w:pPr>
+              <w:spacing w:after="0"/>
+            </w:pPr>
+            <w:r/>
+            <w:r>
+              <w:rPr>
+                <w:rFonts w:ascii="Calibri" w:hAnsi="Calibri"/>
+                <w:b w:val="0"/>
+                <w:sz w:val="20"/>
+              </w:rPr>
+              <w:t>После раздела 'Фоновые задачи, события и CQRS'</w:t>
+            </w:r>
+          </w:p>
+        </w:tc>
+        <w:tc>
+          <w:tcPr>
+            <w:tcW w:type="dxa" w:w="2520"/>
+            <w:vAlign w:val="center"/>
+          </w:tcPr>
+          <w:p>
+            <w:pPr>
+              <w:spacing w:after="0"/>
+            </w:pPr>
+            <w:r/>
+            <w:r>
+              <w:rPr>
+                <w:rFonts w:ascii="Calibri" w:hAnsi="Calibri"/>
+                <w:b w:val="0"/>
+                <w:sz w:val="20"/>
+              </w:rPr>
+              <w:t>Command/query, очередь событий и read-model.</w:t>
+            </w:r>
+          </w:p>
+        </w:tc>
+      </w:tr>
+      <w:tr>
+        <w:tc>
+          <w:tcPr>
+            <w:tcW w:type="dxa" w:w="2520"/>
+            <w:vAlign w:val="center"/>
+          </w:tcPr>
+          <w:p>
+            <w:pPr>
+              <w:spacing w:after="0"/>
+            </w:pPr>
+            <w:r/>
+            <w:r>
+              <w:rPr>
+                <w:rFonts w:ascii="Calibri" w:hAnsi="Calibri"/>
+                <w:b w:val="0"/>
+                <w:sz w:val="20"/>
+              </w:rPr>
+              <w:t>docs/diagrams/architecture.puml</w:t>
+            </w:r>
+          </w:p>
+        </w:tc>
+        <w:tc>
+          <w:tcPr>
+            <w:tcW w:type="dxa" w:w="2520"/>
+            <w:vAlign w:val="center"/>
+          </w:tcPr>
+          <w:p>
+            <w:pPr>
+              <w:spacing w:after="0"/>
+            </w:pPr>
+            <w:r/>
+            <w:r>
+              <w:rPr>
+                <w:rFonts w:ascii="Calibri" w:hAnsi="Calibri"/>
+                <w:b w:val="0"/>
+                <w:sz w:val="20"/>
+              </w:rPr>
+              <w:t>Component</w:t>
+            </w:r>
+          </w:p>
+        </w:tc>
+        <w:tc>
+          <w:tcPr>
+            <w:tcW w:type="dxa" w:w="2520"/>
+            <w:vAlign w:val="center"/>
+          </w:tcPr>
+          <w:p>
+            <w:pPr>
+              <w:spacing w:after="0"/>
+            </w:pPr>
+            <w:r/>
+            <w:r>
+              <w:rPr>
+                <w:rFonts w:ascii="Calibri" w:hAnsi="Calibri"/>
+                <w:b w:val="0"/>
+                <w:sz w:val="20"/>
+              </w:rPr>
+              <w:t>В презентацию или архитектуру</w:t>
+            </w:r>
+          </w:p>
+        </w:tc>
+        <w:tc>
+          <w:tcPr>
+            <w:tcW w:type="dxa" w:w="2520"/>
+            <w:vAlign w:val="center"/>
+          </w:tcPr>
+          <w:p>
+            <w:pPr>
+              <w:spacing w:after="0"/>
+            </w:pPr>
+            <w:r/>
+            <w:r>
+              <w:rPr>
+                <w:rFonts w:ascii="Calibri" w:hAnsi="Calibri"/>
+                <w:b w:val="0"/>
+                <w:sz w:val="20"/>
+              </w:rPr>
+              <w:t>Общая схема клиентов, API и базы.</w:t>
+            </w:r>
+          </w:p>
+        </w:tc>
+      </w:tr>
+    </w:tbl>
+    <w:p/>
+    <w:p>
+      <w:pPr>
+        <w:pStyle w:val="21"/>
+      </w:pPr>
+      <w:r>
+        <w:rPr>
+          <w:rFonts w:ascii="Calibri" w:hAnsi="Calibri"/>
+          <w:color w:val="0F2346"/>
+        </w:rPr>
+        <w:t>ТАБЛИЦА API ДЛЯ ДЕМОНСТРАЦИИ</w:t>
+      </w:r>
+    </w:p>
+    <w:tbl>
+      <w:tblPr>
+        <w:tblStyle w:val="aff0"/>
+        <w:tblW w:type="auto" w:w="0"/>
+        <w:jc w:val="center"/>
+        <w:tblLook w:firstColumn="1" w:firstRow="1" w:lastColumn="0" w:lastRow="0" w:noHBand="0" w:noVBand="1" w:val="04A0"/>
+      </w:tblPr>
+      <w:tblGrid>
+        <w:gridCol w:w="2520"/>
+        <w:gridCol w:w="2520"/>
+        <w:gridCol w:w="2520"/>
+        <w:gridCol w:w="2520"/>
+      </w:tblGrid>
+      <w:tr>
+        <w:tc>
+          <w:tcPr>
+            <w:tcW w:type="dxa" w:w="2520"/>
+            <w:vAlign w:val="center"/>
+            <w:shd w:fill="EAF2FF"/>
+          </w:tcPr>
+          <w:p>
+            <w:pPr>
+              <w:spacing w:after="0"/>
+            </w:pPr>
+            <w:r/>
+            <w:r>
+              <w:rPr>
+                <w:rFonts w:ascii="Calibri" w:hAnsi="Calibri"/>
+                <w:b/>
+                <w:sz w:val="20"/>
+              </w:rPr>
+              <w:t>Операция</w:t>
+            </w:r>
+          </w:p>
+        </w:tc>
+        <w:tc>
+          <w:tcPr>
+            <w:tcW w:type="dxa" w:w="2520"/>
+            <w:vAlign w:val="center"/>
+            <w:shd w:fill="EAF2FF"/>
+          </w:tcPr>
+          <w:p>
+            <w:pPr>
+              <w:spacing w:after="0"/>
+            </w:pPr>
+            <w:r/>
+            <w:r>
+              <w:rPr>
+                <w:rFonts w:ascii="Calibri" w:hAnsi="Calibri"/>
+                <w:b/>
+                <w:sz w:val="20"/>
+              </w:rPr>
+              <w:t>HTTP</w:t>
+            </w:r>
+          </w:p>
+        </w:tc>
+        <w:tc>
+          <w:tcPr>
+            <w:tcW w:type="dxa" w:w="2520"/>
+            <w:vAlign w:val="center"/>
+            <w:shd w:fill="EAF2FF"/>
+          </w:tcPr>
+          <w:p>
+            <w:pPr>
+              <w:spacing w:after="0"/>
+            </w:pPr>
+            <w:r/>
+            <w:r>
+              <w:rPr>
+                <w:rFonts w:ascii="Calibri" w:hAnsi="Calibri"/>
+                <w:b/>
+                <w:sz w:val="20"/>
+              </w:rPr>
+              <w:t>Endpoint</w:t>
+            </w:r>
+          </w:p>
+        </w:tc>
+        <w:tc>
+          <w:tcPr>
+            <w:tcW w:type="dxa" w:w="2520"/>
+            <w:vAlign w:val="center"/>
+            <w:shd w:fill="EAF2FF"/>
+          </w:tcPr>
+          <w:p>
+            <w:pPr>
+              <w:spacing w:after="0"/>
+            </w:pPr>
+            <w:r/>
+            <w:r>
+              <w:rPr>
+                <w:rFonts w:ascii="Calibri" w:hAnsi="Calibri"/>
+                <w:b/>
+                <w:sz w:val="20"/>
+              </w:rPr>
+              <w:t>Клиент</w:t>
+            </w:r>
+          </w:p>
+        </w:tc>
+      </w:tr>
+      <w:tr>
+        <w:tc>
+          <w:tcPr>
+            <w:tcW w:type="dxa" w:w="2520"/>
+            <w:vAlign w:val="center"/>
+          </w:tcPr>
+          <w:p>
+            <w:pPr>
+              <w:spacing w:after="0"/>
+            </w:pPr>
+            <w:r/>
+            <w:r>
+              <w:rPr>
+                <w:rFonts w:ascii="Calibri" w:hAnsi="Calibri"/>
+                <w:b w:val="0"/>
+                <w:sz w:val="20"/>
+              </w:rPr>
+              <w:t>Вход</w:t>
+            </w:r>
+          </w:p>
+        </w:tc>
+        <w:tc>
+          <w:tcPr>
+            <w:tcW w:type="dxa" w:w="2520"/>
+            <w:vAlign w:val="center"/>
+          </w:tcPr>
+          <w:p>
+            <w:pPr>
+              <w:spacing w:after="0"/>
+            </w:pPr>
+            <w:r/>
+            <w:r>
+              <w:rPr>
+                <w:rFonts w:ascii="Calibri" w:hAnsi="Calibri"/>
+                <w:b w:val="0"/>
+                <w:sz w:val="20"/>
+              </w:rPr>
+              <w:t>POST</w:t>
+            </w:r>
+          </w:p>
+        </w:tc>
+        <w:tc>
+          <w:tcPr>
+            <w:tcW w:type="dxa" w:w="2520"/>
+            <w:vAlign w:val="center"/>
+          </w:tcPr>
+          <w:p>
+            <w:pPr>
+              <w:spacing w:after="0"/>
+            </w:pPr>
+            <w:r/>
+            <w:r>
+              <w:rPr>
+                <w:rFonts w:ascii="Calibri" w:hAnsi="Calibri"/>
+                <w:b w:val="0"/>
+                <w:sz w:val="20"/>
+              </w:rPr>
+              <w:t>/auth/login</w:t>
+            </w:r>
+          </w:p>
+        </w:tc>
+        <w:tc>
+          <w:tcPr>
+            <w:tcW w:type="dxa" w:w="2520"/>
+            <w:vAlign w:val="center"/>
+          </w:tcPr>
+          <w:p>
+            <w:pPr>
+              <w:spacing w:after="0"/>
+            </w:pPr>
+            <w:r/>
+            <w:r>
+              <w:rPr>
+                <w:rFonts w:ascii="Calibri" w:hAnsi="Calibri"/>
+                <w:b w:val="0"/>
+                <w:sz w:val="20"/>
+              </w:rPr>
+              <w:t>Web / Desktop / APK</w:t>
+            </w:r>
+          </w:p>
+        </w:tc>
+      </w:tr>
+      <w:tr>
+        <w:tc>
+          <w:tcPr>
+            <w:tcW w:type="dxa" w:w="2520"/>
+            <w:vAlign w:val="center"/>
+          </w:tcPr>
+          <w:p>
+            <w:pPr>
+              <w:spacing w:after="0"/>
+            </w:pPr>
+            <w:r/>
+            <w:r>
+              <w:rPr>
+                <w:rFonts w:ascii="Calibri" w:hAnsi="Calibri"/>
+                <w:b w:val="0"/>
+                <w:sz w:val="20"/>
+              </w:rPr>
+              <w:t>Регистрация заявки</w:t>
+            </w:r>
+          </w:p>
+        </w:tc>
+        <w:tc>
+          <w:tcPr>
+            <w:tcW w:type="dxa" w:w="2520"/>
+            <w:vAlign w:val="center"/>
+          </w:tcPr>
+          <w:p>
+            <w:pPr>
+              <w:spacing w:after="0"/>
+            </w:pPr>
+            <w:r/>
+            <w:r>
+              <w:rPr>
+                <w:rFonts w:ascii="Calibri" w:hAnsi="Calibri"/>
+                <w:b w:val="0"/>
+                <w:sz w:val="20"/>
+              </w:rPr>
+              <w:t>POST</w:t>
+            </w:r>
+          </w:p>
+        </w:tc>
+        <w:tc>
+          <w:tcPr>
+            <w:tcW w:type="dxa" w:w="2520"/>
+            <w:vAlign w:val="center"/>
+          </w:tcPr>
+          <w:p>
+            <w:pPr>
+              <w:spacing w:after="0"/>
+            </w:pPr>
+            <w:r/>
+            <w:r>
+              <w:rPr>
+                <w:rFonts w:ascii="Calibri" w:hAnsi="Calibri"/>
+                <w:b w:val="0"/>
+                <w:sz w:val="20"/>
+              </w:rPr>
+              <w:t>/auth/register</w:t>
+            </w:r>
+          </w:p>
+        </w:tc>
+        <w:tc>
+          <w:tcPr>
+            <w:tcW w:type="dxa" w:w="2520"/>
+            <w:vAlign w:val="center"/>
+          </w:tcPr>
+          <w:p>
+            <w:pPr>
+              <w:spacing w:after="0"/>
+            </w:pPr>
+            <w:r/>
+            <w:r>
+              <w:rPr>
+                <w:rFonts w:ascii="Calibri" w:hAnsi="Calibri"/>
+                <w:b w:val="0"/>
+                <w:sz w:val="20"/>
+              </w:rPr>
+              <w:t>Web / Desktop / APK</w:t>
+            </w:r>
+          </w:p>
+        </w:tc>
+      </w:tr>
+      <w:tr>
+        <w:tc>
+          <w:tcPr>
+            <w:tcW w:type="dxa" w:w="2520"/>
+            <w:vAlign w:val="center"/>
+          </w:tcPr>
+          <w:p>
+            <w:pPr>
+              <w:spacing w:after="0"/>
+            </w:pPr>
+            <w:r/>
+            <w:r>
+              <w:rPr>
+                <w:rFonts w:ascii="Calibri" w:hAnsi="Calibri"/>
+                <w:b w:val="0"/>
+                <w:sz w:val="20"/>
+              </w:rPr>
+              <w:t>Текущий пользователь</w:t>
+            </w:r>
+          </w:p>
+        </w:tc>
+        <w:tc>
+          <w:tcPr>
+            <w:tcW w:type="dxa" w:w="2520"/>
+            <w:vAlign w:val="center"/>
+          </w:tcPr>
+          <w:p>
+            <w:pPr>
+              <w:spacing w:after="0"/>
+            </w:pPr>
+            <w:r/>
+            <w:r>
+              <w:rPr>
+                <w:rFonts w:ascii="Calibri" w:hAnsi="Calibri"/>
+                <w:b w:val="0"/>
+                <w:sz w:val="20"/>
+              </w:rPr>
+              <w:t>GET</w:t>
+            </w:r>
+          </w:p>
+        </w:tc>
+        <w:tc>
+          <w:tcPr>
+            <w:tcW w:type="dxa" w:w="2520"/>
+            <w:vAlign w:val="center"/>
+          </w:tcPr>
+          <w:p>
+            <w:pPr>
+              <w:spacing w:after="0"/>
+            </w:pPr>
+            <w:r/>
+            <w:r>
+              <w:rPr>
+                <w:rFonts w:ascii="Calibri" w:hAnsi="Calibri"/>
+                <w:b w:val="0"/>
+                <w:sz w:val="20"/>
+              </w:rPr>
+              <w:t>/api/me</w:t>
+            </w:r>
+          </w:p>
+        </w:tc>
+        <w:tc>
+          <w:tcPr>
+            <w:tcW w:type="dxa" w:w="2520"/>
+            <w:vAlign w:val="center"/>
+          </w:tcPr>
+          <w:p>
+            <w:pPr>
+              <w:spacing w:after="0"/>
+            </w:pPr>
+            <w:r/>
+            <w:r>
+              <w:rPr>
+                <w:rFonts w:ascii="Calibri" w:hAnsi="Calibri"/>
+                <w:b w:val="0"/>
+                <w:sz w:val="20"/>
+              </w:rPr>
+              <w:t>Все клиенты</w:t>
+            </w:r>
+          </w:p>
+        </w:tc>
+      </w:tr>
+      <w:tr>
+        <w:tc>
+          <w:tcPr>
+            <w:tcW w:type="dxa" w:w="2520"/>
+            <w:vAlign w:val="center"/>
+          </w:tcPr>
+          <w:p>
+            <w:pPr>
+              <w:spacing w:after="0"/>
+            </w:pPr>
+            <w:r/>
+            <w:r>
+              <w:rPr>
+                <w:rFonts w:ascii="Calibri" w:hAnsi="Calibri"/>
+                <w:b w:val="0"/>
+                <w:sz w:val="20"/>
+              </w:rPr>
+              <w:t>Создать инцидент</w:t>
+            </w:r>
+          </w:p>
+        </w:tc>
+        <w:tc>
+          <w:tcPr>
+            <w:tcW w:type="dxa" w:w="2520"/>
+            <w:vAlign w:val="center"/>
+          </w:tcPr>
+          <w:p>
+            <w:pPr>
+              <w:spacing w:after="0"/>
+            </w:pPr>
+            <w:r/>
+            <w:r>
+              <w:rPr>
+                <w:rFonts w:ascii="Calibri" w:hAnsi="Calibri"/>
+                <w:b w:val="0"/>
+                <w:sz w:val="20"/>
+              </w:rPr>
+              <w:t>POST</w:t>
+            </w:r>
+          </w:p>
+        </w:tc>
+        <w:tc>
+          <w:tcPr>
+            <w:tcW w:type="dxa" w:w="2520"/>
+            <w:vAlign w:val="center"/>
+          </w:tcPr>
+          <w:p>
+            <w:pPr>
+              <w:spacing w:after="0"/>
+            </w:pPr>
+            <w:r/>
+            <w:r>
+              <w:rPr>
+                <w:rFonts w:ascii="Calibri" w:hAnsi="Calibri"/>
+                <w:b w:val="0"/>
+                <w:sz w:val="20"/>
+              </w:rPr>
+              <w:t>/api/incidents</w:t>
+            </w:r>
+          </w:p>
+        </w:tc>
+        <w:tc>
+          <w:tcPr>
+            <w:tcW w:type="dxa" w:w="2520"/>
+            <w:vAlign w:val="center"/>
+          </w:tcPr>
+          <w:p>
+            <w:pPr>
+              <w:spacing w:after="0"/>
+            </w:pPr>
+            <w:r/>
+            <w:r>
+              <w:rPr>
+                <w:rFonts w:ascii="Calibri" w:hAnsi="Calibri"/>
+                <w:b w:val="0"/>
+                <w:sz w:val="20"/>
+              </w:rPr>
+              <w:t>APK</w:t>
+            </w:r>
+          </w:p>
+        </w:tc>
+      </w:tr>
+      <w:tr>
+        <w:tc>
+          <w:tcPr>
+            <w:tcW w:type="dxa" w:w="2520"/>
+            <w:vAlign w:val="center"/>
+          </w:tcPr>
+          <w:p>
+            <w:pPr>
+              <w:spacing w:after="0"/>
+            </w:pPr>
+            <w:r/>
+            <w:r>
+              <w:rPr>
+                <w:rFonts w:ascii="Calibri" w:hAnsi="Calibri"/>
+                <w:b w:val="0"/>
+                <w:sz w:val="20"/>
+              </w:rPr>
+              <w:t>Риски эксперта</w:t>
+            </w:r>
+          </w:p>
+        </w:tc>
+        <w:tc>
+          <w:tcPr>
+            <w:tcW w:type="dxa" w:w="2520"/>
+            <w:vAlign w:val="center"/>
+          </w:tcPr>
+          <w:p>
+            <w:pPr>
+              <w:spacing w:after="0"/>
+            </w:pPr>
+            <w:r/>
+            <w:r>
+              <w:rPr>
+                <w:rFonts w:ascii="Calibri" w:hAnsi="Calibri"/>
+                <w:b w:val="0"/>
+                <w:sz w:val="20"/>
+              </w:rPr>
+              <w:t>GET</w:t>
+            </w:r>
+          </w:p>
+        </w:tc>
+        <w:tc>
+          <w:tcPr>
+            <w:tcW w:type="dxa" w:w="2520"/>
+            <w:vAlign w:val="center"/>
+          </w:tcPr>
+          <w:p>
+            <w:pPr>
+              <w:spacing w:after="0"/>
+            </w:pPr>
+            <w:r/>
+            <w:r>
+              <w:rPr>
+                <w:rFonts w:ascii="Calibri" w:hAnsi="Calibri"/>
+                <w:b w:val="0"/>
+                <w:sz w:val="20"/>
+              </w:rPr>
+              <w:t>/api/expert/risks</w:t>
+            </w:r>
+          </w:p>
+        </w:tc>
+        <w:tc>
+          <w:tcPr>
+            <w:tcW w:type="dxa" w:w="2520"/>
+            <w:vAlign w:val="center"/>
+          </w:tcPr>
+          <w:p>
+            <w:pPr>
+              <w:spacing w:after="0"/>
+            </w:pPr>
+            <w:r/>
+            <w:r>
+              <w:rPr>
+                <w:rFonts w:ascii="Calibri" w:hAnsi="Calibri"/>
+                <w:b w:val="0"/>
+                <w:sz w:val="20"/>
+              </w:rPr>
+              <w:t>Desktop</w:t>
+            </w:r>
+          </w:p>
+        </w:tc>
+      </w:tr>
+      <w:tr>
+        <w:tc>
+          <w:tcPr>
+            <w:tcW w:type="dxa" w:w="2520"/>
+            <w:vAlign w:val="center"/>
+          </w:tcPr>
+          <w:p>
+            <w:pPr>
+              <w:spacing w:after="0"/>
+            </w:pPr>
+            <w:r/>
+            <w:r>
+              <w:rPr>
+                <w:rFonts w:ascii="Calibri" w:hAnsi="Calibri"/>
+                <w:b w:val="0"/>
+                <w:sz w:val="20"/>
+              </w:rPr>
+              <w:t>Оценить риск</w:t>
+            </w:r>
+          </w:p>
+        </w:tc>
+        <w:tc>
+          <w:tcPr>
+            <w:tcW w:type="dxa" w:w="2520"/>
+            <w:vAlign w:val="center"/>
+          </w:tcPr>
+          <w:p>
+            <w:pPr>
+              <w:spacing w:after="0"/>
+            </w:pPr>
+            <w:r/>
+            <w:r>
+              <w:rPr>
+                <w:rFonts w:ascii="Calibri" w:hAnsi="Calibri"/>
+                <w:b w:val="0"/>
+                <w:sz w:val="20"/>
+              </w:rPr>
+              <w:t>POST</w:t>
+            </w:r>
+          </w:p>
+        </w:tc>
+        <w:tc>
+          <w:tcPr>
+            <w:tcW w:type="dxa" w:w="2520"/>
+            <w:vAlign w:val="center"/>
+          </w:tcPr>
+          <w:p>
+            <w:pPr>
+              <w:spacing w:after="0"/>
+            </w:pPr>
+            <w:r/>
+            <w:r>
+              <w:rPr>
+                <w:rFonts w:ascii="Calibri" w:hAnsi="Calibri"/>
+                <w:b w:val="0"/>
+                <w:sz w:val="20"/>
+              </w:rPr>
+              <w:t>/api/risks/{id}/assessments</w:t>
+            </w:r>
+          </w:p>
+        </w:tc>
+        <w:tc>
+          <w:tcPr>
+            <w:tcW w:type="dxa" w:w="2520"/>
+            <w:vAlign w:val="center"/>
+          </w:tcPr>
+          <w:p>
+            <w:pPr>
+              <w:spacing w:after="0"/>
+            </w:pPr>
+            <w:r/>
+            <w:r>
+              <w:rPr>
+                <w:rFonts w:ascii="Calibri" w:hAnsi="Calibri"/>
+                <w:b w:val="0"/>
+                <w:sz w:val="20"/>
+              </w:rPr>
+              <w:t>Desktop</w:t>
+            </w:r>
+          </w:p>
+        </w:tc>
+      </w:tr>
+      <w:tr>
+        <w:tc>
+          <w:tcPr>
+            <w:tcW w:type="dxa" w:w="2520"/>
+            <w:vAlign w:val="center"/>
+          </w:tcPr>
+          <w:p>
+            <w:pPr>
+              <w:spacing w:after="0"/>
+            </w:pPr>
+            <w:r/>
+            <w:r>
+              <w:rPr>
+                <w:rFonts w:ascii="Calibri" w:hAnsi="Calibri"/>
+                <w:b w:val="0"/>
+                <w:sz w:val="20"/>
+              </w:rPr>
+              <w:t>CQRS список рисков</w:t>
+            </w:r>
+          </w:p>
+        </w:tc>
+        <w:tc>
+          <w:tcPr>
+            <w:tcW w:type="dxa" w:w="2520"/>
+            <w:vAlign w:val="center"/>
+          </w:tcPr>
+          <w:p>
+            <w:pPr>
+              <w:spacing w:after="0"/>
+            </w:pPr>
+            <w:r/>
+            <w:r>
+              <w:rPr>
+                <w:rFonts w:ascii="Calibri" w:hAnsi="Calibri"/>
+                <w:b w:val="0"/>
+                <w:sz w:val="20"/>
+              </w:rPr>
+              <w:t>GET</w:t>
+            </w:r>
+          </w:p>
+        </w:tc>
+        <w:tc>
+          <w:tcPr>
+            <w:tcW w:type="dxa" w:w="2520"/>
+            <w:vAlign w:val="center"/>
+          </w:tcPr>
+          <w:p>
+            <w:pPr>
+              <w:spacing w:after="0"/>
+            </w:pPr>
+            <w:r/>
+            <w:r>
+              <w:rPr>
+                <w:rFonts w:ascii="Calibri" w:hAnsi="Calibri"/>
+                <w:b w:val="0"/>
+                <w:sz w:val="20"/>
+              </w:rPr>
+              <w:t>/api/queries/risks</w:t>
+            </w:r>
+          </w:p>
+        </w:tc>
+        <w:tc>
+          <w:tcPr>
+            <w:tcW w:type="dxa" w:w="2520"/>
+            <w:vAlign w:val="center"/>
+          </w:tcPr>
+          <w:p>
+            <w:pPr>
+              <w:spacing w:after="0"/>
+            </w:pPr>
+            <w:r/>
+            <w:r>
+              <w:rPr>
+                <w:rFonts w:ascii="Calibri" w:hAnsi="Calibri"/>
+                <w:b w:val="0"/>
+                <w:sz w:val="20"/>
+              </w:rPr>
+              <w:t>Web/API</w:t>
+            </w:r>
+          </w:p>
+        </w:tc>
+      </w:tr>
+      <w:tr>
+        <w:tc>
+          <w:tcPr>
+            <w:tcW w:type="dxa" w:w="2520"/>
+            <w:vAlign w:val="center"/>
+          </w:tcPr>
+          <w:p>
+            <w:pPr>
+              <w:spacing w:after="0"/>
+            </w:pPr>
+            <w:r/>
+            <w:r>
+              <w:rPr>
+                <w:rFonts w:ascii="Calibri" w:hAnsi="Calibri"/>
+                <w:b w:val="0"/>
+                <w:sz w:val="20"/>
+              </w:rPr>
+              <w:t>Обработать события</w:t>
+            </w:r>
+          </w:p>
+        </w:tc>
+        <w:tc>
+          <w:tcPr>
+            <w:tcW w:type="dxa" w:w="2520"/>
+            <w:vAlign w:val="center"/>
+          </w:tcPr>
+          <w:p>
+            <w:pPr>
+              <w:spacing w:after="0"/>
+            </w:pPr>
+            <w:r/>
+            <w:r>
+              <w:rPr>
+                <w:rFonts w:ascii="Calibri" w:hAnsi="Calibri"/>
+                <w:b w:val="0"/>
+                <w:sz w:val="20"/>
+              </w:rPr>
+              <w:t>POST</w:t>
+            </w:r>
+          </w:p>
+        </w:tc>
+        <w:tc>
+          <w:tcPr>
+            <w:tcW w:type="dxa" w:w="2520"/>
+            <w:vAlign w:val="center"/>
+          </w:tcPr>
+          <w:p>
+            <w:pPr>
+              <w:spacing w:after="0"/>
+            </w:pPr>
+            <w:r/>
+            <w:r>
+              <w:rPr>
+                <w:rFonts w:ascii="Calibri" w:hAnsi="Calibri"/>
+                <w:b w:val="0"/>
+                <w:sz w:val="20"/>
+              </w:rPr>
+              <w:t>/api/commands/events/process</w:t>
+            </w:r>
+          </w:p>
+        </w:tc>
+        <w:tc>
+          <w:tcPr>
+            <w:tcW w:type="dxa" w:w="2520"/>
+            <w:vAlign w:val="center"/>
+          </w:tcPr>
+          <w:p>
+            <w:pPr>
+              <w:spacing w:after="0"/>
+            </w:pPr>
+            <w:r/>
+            <w:r>
+              <w:rPr>
+                <w:rFonts w:ascii="Calibri" w:hAnsi="Calibri"/>
+                <w:b w:val="0"/>
+                <w:sz w:val="20"/>
+              </w:rPr>
+              <w:t>Web/API</w:t>
+            </w:r>
+          </w:p>
+        </w:tc>
+      </w:tr>
+      <w:tr>
+        <w:tc>
+          <w:tcPr>
+            <w:tcW w:type="dxa" w:w="2520"/>
+            <w:vAlign w:val="center"/>
+          </w:tcPr>
+          <w:p>
+            <w:pPr>
+              <w:spacing w:after="0"/>
+            </w:pPr>
+            <w:r/>
+            <w:r>
+              <w:rPr>
+                <w:rFonts w:ascii="Calibri" w:hAnsi="Calibri"/>
+                <w:b w:val="0"/>
+                <w:sz w:val="20"/>
+              </w:rPr>
+              <w:t>Тепловая карта</w:t>
+            </w:r>
+          </w:p>
+        </w:tc>
+        <w:tc>
+          <w:tcPr>
+            <w:tcW w:type="dxa" w:w="2520"/>
+            <w:vAlign w:val="center"/>
+          </w:tcPr>
+          <w:p>
+            <w:pPr>
+              <w:spacing w:after="0"/>
+            </w:pPr>
+            <w:r/>
+            <w:r>
+              <w:rPr>
+                <w:rFonts w:ascii="Calibri" w:hAnsi="Calibri"/>
+                <w:b w:val="0"/>
+                <w:sz w:val="20"/>
+              </w:rPr>
+              <w:t>GET</w:t>
+            </w:r>
+          </w:p>
+        </w:tc>
+        <w:tc>
+          <w:tcPr>
+            <w:tcW w:type="dxa" w:w="2520"/>
+            <w:vAlign w:val="center"/>
+          </w:tcPr>
+          <w:p>
+            <w:pPr>
+              <w:spacing w:after="0"/>
+            </w:pPr>
+            <w:r/>
+            <w:r>
+              <w:rPr>
+                <w:rFonts w:ascii="Calibri" w:hAnsi="Calibri"/>
+                <w:b w:val="0"/>
+                <w:sz w:val="20"/>
+              </w:rPr>
+              <w:t>/api/heatmap</w:t>
+            </w:r>
+          </w:p>
+        </w:tc>
+        <w:tc>
+          <w:tcPr>
+            <w:tcW w:type="dxa" w:w="2520"/>
+            <w:vAlign w:val="center"/>
+          </w:tcPr>
+          <w:p>
+            <w:pPr>
+              <w:spacing w:after="0"/>
+            </w:pPr>
+            <w:r/>
+            <w:r>
+              <w:rPr>
+                <w:rFonts w:ascii="Calibri" w:hAnsi="Calibri"/>
+                <w:b w:val="0"/>
+                <w:sz w:val="20"/>
+              </w:rPr>
+              <w:t>Web/API</w:t>
+            </w:r>
+          </w:p>
+        </w:tc>
+      </w:tr>
+    </w:tbl>
+    <w:p/>
+    <w:p>
+      <w:pPr>
+        <w:pStyle w:val="21"/>
+      </w:pPr>
+      <w:r>
+        <w:rPr>
+          <w:rFonts w:ascii="Calibri" w:hAnsi="Calibri"/>
+          <w:color w:val="0F2346"/>
+        </w:rPr>
+        <w:t>ДОПОЛНИТЕЛЬНЫЕ МАТЕРИАЛЫ ДЛЯ СДАЧИ</w:t>
+      </w:r>
+    </w:p>
+    <w:p>
+      <w:pPr>
+        <w:pStyle w:val="a0"/>
+      </w:pPr>
+      <w:r>
+        <w:t>Сгенерированные изображения диаграмм в PNG/SVG после экспорта из PlantUML.</w:t>
+      </w:r>
+    </w:p>
+    <w:p>
+      <w:pPr>
+        <w:pStyle w:val="a0"/>
+      </w:pPr>
+      <w:r>
+        <w:t>Презентация со скриншотами ключевых экранов: web, APK, desktop, отчеты и релизные файлы.</w:t>
+      </w:r>
+    </w:p>
+    <w:p>
+      <w:pPr>
+        <w:pStyle w:val="a0"/>
+      </w:pPr>
+      <w:r>
+        <w:t>Файл README.md с командами запуска и переноса на другой ПК.</w:t>
+      </w:r>
+    </w:p>
+    <w:p>
+      <w:pPr>
+        <w:pStyle w:val="a0"/>
+      </w:pPr>
+      <w:r>
+        <w:t>Папка release с APK и desktop-установщиком.</w:t>
+      </w:r>
+    </w:p>
     <w:sectPr>
       <w:footerReference w:type="default" r:id="rId11"/>
       <w:pgSz w:w="12240" w:h="15840"/>
@@ -6375,10 +10512,7 @@
       <w:jc w:val="center"/>
     </w:pPr>
     <w:r>
-      <w:t xml:space="preserve">RiskGuard — </w:t>
-    </w:r>
-    <w:r>
-      <w:t>документация проекта</w:t>
+      <w:t>RiskGuard — документация проекта</w:t>
     </w:r>
   </w:p>
 </w:ftr>

</xml_diff>